<commit_message>
X2/X3 done: answer-blind zero offsets and refits of the 10 zero-padded pressure-series patterns change no critic2 first place (paired top-1 0.00 [0.00, 0.00] each; refits lift the own-entry control 1 -> 7 of 10, injection 1 -> 5 of 9); Sections 3.8/4.2/Discussion/Limitations, ESI S18c/S18d, verify 196/196
</commit_message>
<xml_diff>
--- a/paper/dd/esi.docx
+++ b/paper/dd/esi.docx
@@ -2,7 +2,7 @@
 <file path=word/document.xml><?xml version="1.0" encoding="utf-8"?>
 <w:document xmlns:w="http://schemas.openxmlformats.org/wordprocessingml/2006/main" xmlns:m="http://schemas.openxmlformats.org/officeDocument/2006/math" xmlns:r="http://schemas.openxmlformats.org/officeDocument/2006/relationships" xmlns:o="urn:schemas-microsoft-com:office:office" xmlns:v="urn:schemas-microsoft-com:vml" xmlns:w10="urn:schemas-microsoft-com:office:word" xmlns:a="http://schemas.openxmlformats.org/drawingml/2006/main" xmlns:pic="http://schemas.openxmlformats.org/drawingml/2006/picture" xmlns:wp="http://schemas.openxmlformats.org/drawingml/2006/wordprocessingDrawing">
   <w:body>
-    <w:bookmarkStart w:id="23" w:name="electronic-supplementary-information"/>
+    <w:bookmarkStart w:id="24" w:name="electronic-supplementary-information"/>
     <w:p>
       <w:pPr>
         <w:pStyle w:val="Heading1"/>
@@ -15186,7 +15186,7 @@
       </w:tr>
     </w:tbl>
     <w:bookmarkEnd w:id="18"/>
-    <w:bookmarkStart w:id="19" w:name="X9e70769d99d076d15454f60d89c3957393e26e4"/>
+    <w:bookmarkStart w:id="20" w:name="X9e70769d99d076d15454f60d89c3957393e26e4"/>
     <w:p>
       <w:pPr>
         <w:pStyle w:val="Heading2"/>
@@ -22345,8 +22345,1481 @@
         <w:t xml:space="preserve">Patterns whose cells differ by more than 1 % (25): pressure series 16; recorded temperatures more than 50 K apart (not pressure series) 7; supercell description 1; none of these 1 (pattern_77).</w:t>
       </w:r>
     </w:p>
+    <w:bookmarkStart w:id="19" w:name="X6aadf836a479e0564a2d0306f33feabb2a778ed"/>
+    <w:p>
+      <w:pPr>
+        <w:pStyle w:val="Heading3"/>
+      </w:pPr>
+      <w:r>
+        <w:t xml:space="preserve">Sensitivity of the re-rank to the zero offset and to the peak fits</w:t>
+      </w:r>
+    </w:p>
+    <w:p>
+      <w:pPr>
+        <w:pStyle w:val="FirstParagraph"/>
+      </w:pPr>
+      <w:r>
+        <w:t xml:space="preserve">Zero offset: each single-crystal pattern gets an answer-blind zero offset δ, the native shift (±0.5°, steps of 0.02°, both scaled by λ/λ(Cu)) that maximises the cosine between the background-subtracted measured pattern on the Cu grid and the clean rendering of its ln q top-1 entry, which is never the answer. The fitted peak positions are shifted by −δ and the 36 shortlists that hold the answer are rerun (1,800 comparisons; a shortlist without the answer stays a miss). Median |δ| 0.07° for the 34 laboratory Cu patterns and 0.14° (Cu-equivalent) over all 59; 8 offsets lie at the edge of the scan.</w:t>
+      </w:r>
+    </w:p>
+    <w:p>
+      <w:pPr>
+        <w:pStyle w:val="BodyText"/>
+      </w:pPr>
+      <w:r>
+        <w:t xml:space="preserve">Peak fits: 10 patterns, all from pressure series, start their measured range with a run of zero-intensity points, which can drive the 20-knot background into large oscillations. Those points are dropped and the patterns refitted with critic2’s default settings; their shortlists (500 comparisons), own-entry controls and answer injections are rerun. A grid search over the fit settings, judged by the own-entry DIFF, was set aside before it ran: that criterion rewards sparse peak lists and would have picked degenerate fits.</w:t>
+      </w:r>
+    </w:p>
+    <w:p>
+      <w:pPr>
+        <w:pStyle w:val="BodyText"/>
+      </w:pPr>
+      <w:r>
+        <w:t xml:space="preserve">Rerun comparisons past the 4-hour limit, counted as maximally dissimilar: pattern_511 against POSHIR (zero offsets, not an answer); pattern_730 against GOGZOU (refits, not an answer).</w:t>
+      </w:r>
+    </w:p>
+    <w:p>
+      <w:pPr>
+        <w:pStyle w:val="BodyText"/>
+      </w:pPr>
+      <w:r>
+        <w:rPr>
+          <w:b/>
+          <w:bCs/>
+        </w:rPr>
+        <w:t xml:space="preserve">Table S18c</w:t>
+      </w:r>
+      <w:r>
+        <w:t xml:space="preserve"> </w:t>
+      </w:r>
+      <w:r>
+        <w:t xml:space="preserve">The re-rank with answer-blind zero offsets and with the refitted pressure-series patterns, against the main re-rank (paired differences over 30 compounds).</w:t>
+      </w:r>
+    </w:p>
+    <w:tbl>
+      <w:tblPr>
+        <w:tblStyle w:val="Table"/>
+        <w:tblW w:type="pct" w:w="5000"/>
+        <w:tblLayout w:type="fixed"/>
+        <w:tblLook w:firstRow="1" w:lastRow="0" w:firstColumn="0" w:lastColumn="0" w:noHBand="0" w:noVBand="0" w:val="0020"/>
+      </w:tblPr>
+      <w:tblGrid>
+        <w:gridCol w:w="990"/>
+        <w:gridCol w:w="990"/>
+        <w:gridCol w:w="990"/>
+        <w:gridCol w:w="990"/>
+        <w:gridCol w:w="990"/>
+        <w:gridCol w:w="990"/>
+        <w:gridCol w:w="990"/>
+        <w:gridCol w:w="990"/>
+      </w:tblGrid>
+      <w:tr>
+        <w:trPr>
+          <w:tblHeader w:val="on"/>
+        </w:trPr>
+        <w:tc>
+          <w:tcPr/>
+          <w:p>
+            <w:pPr>
+              <w:pStyle w:val="Compact"/>
+            </w:pPr>
+            <w:r>
+              <w:t xml:space="preserve">re-rank</w:t>
+            </w:r>
+          </w:p>
+        </w:tc>
+        <w:tc>
+          <w:tcPr/>
+          <w:p>
+            <w:pPr>
+              <w:pStyle w:val="Compact"/>
+            </w:pPr>
+            <w:r>
+              <w:t xml:space="preserve">comparisons rerun</w:t>
+            </w:r>
+          </w:p>
+        </w:tc>
+        <w:tc>
+          <w:tcPr/>
+          <w:p>
+            <w:pPr>
+              <w:pStyle w:val="Compact"/>
+            </w:pPr>
+            <w:r>
+              <w:t xml:space="preserve">macro top-1</w:t>
+            </w:r>
+          </w:p>
+        </w:tc>
+        <w:tc>
+          <w:tcPr/>
+          <w:p>
+            <w:pPr>
+              <w:pStyle w:val="Compact"/>
+            </w:pPr>
+            <w:r>
+              <w:t xml:space="preserve">− main, top-1</w:t>
+            </w:r>
+          </w:p>
+        </w:tc>
+        <w:tc>
+          <w:tcPr/>
+          <w:p>
+            <w:pPr>
+              <w:pStyle w:val="Compact"/>
+            </w:pPr>
+            <w:r>
+              <w:t xml:space="preserve">macro top-10</w:t>
+            </w:r>
+          </w:p>
+        </w:tc>
+        <w:tc>
+          <w:tcPr/>
+          <w:p>
+            <w:pPr>
+              <w:pStyle w:val="Compact"/>
+            </w:pPr>
+            <w:r>
+              <w:t xml:space="preserve">− main, top-10</w:t>
+            </w:r>
+          </w:p>
+        </w:tc>
+        <w:tc>
+          <w:tcPr/>
+          <w:p>
+            <w:pPr>
+              <w:pStyle w:val="Compact"/>
+            </w:pPr>
+            <w:r>
+              <w:t xml:space="preserve">first places</w:t>
+            </w:r>
+          </w:p>
+        </w:tc>
+        <w:tc>
+          <w:tcPr/>
+          <w:p>
+            <w:pPr>
+              <w:pStyle w:val="Compact"/>
+            </w:pPr>
+            <w:r>
+              <w:t xml:space="preserve">patterns whose rank changes</w:t>
+            </w:r>
+          </w:p>
+        </w:tc>
+      </w:tr>
+      <w:tr>
+        <w:tc>
+          <w:tcPr/>
+          <w:p>
+            <w:pPr>
+              <w:pStyle w:val="Compact"/>
+            </w:pPr>
+            <w:r>
+              <w:t xml:space="preserve">main</w:t>
+            </w:r>
+          </w:p>
+        </w:tc>
+        <w:tc>
+          <w:tcPr/>
+          <w:p>
+            <w:pPr>
+              <w:pStyle w:val="Compact"/>
+            </w:pPr>
+          </w:p>
+        </w:tc>
+        <w:tc>
+          <w:tcPr/>
+          <w:p>
+            <w:pPr>
+              <w:pStyle w:val="Compact"/>
+            </w:pPr>
+            <w:r>
+              <w:t xml:space="preserve">0.53 [0.37, 0.70]</w:t>
+            </w:r>
+          </w:p>
+        </w:tc>
+        <w:tc>
+          <w:tcPr/>
+          <w:p>
+            <w:pPr>
+              <w:pStyle w:val="Compact"/>
+            </w:pPr>
+          </w:p>
+        </w:tc>
+        <w:tc>
+          <w:tcPr/>
+          <w:p>
+            <w:pPr>
+              <w:pStyle w:val="Compact"/>
+            </w:pPr>
+            <w:r>
+              <w:t xml:space="preserve">0.62 [0.45, 0.79]</w:t>
+            </w:r>
+          </w:p>
+        </w:tc>
+        <w:tc>
+          <w:tcPr/>
+          <w:p>
+            <w:pPr>
+              <w:pStyle w:val="Compact"/>
+            </w:pPr>
+          </w:p>
+        </w:tc>
+        <w:tc>
+          <w:tcPr/>
+          <w:p>
+            <w:pPr>
+              <w:pStyle w:val="Compact"/>
+            </w:pPr>
+            <w:r>
+              <w:t xml:space="preserve">27</w:t>
+            </w:r>
+          </w:p>
+        </w:tc>
+        <w:tc>
+          <w:tcPr/>
+          <w:p>
+            <w:pPr>
+              <w:pStyle w:val="Compact"/>
+            </w:pPr>
+          </w:p>
+        </w:tc>
+      </w:tr>
+      <w:tr>
+        <w:tc>
+          <w:tcPr/>
+          <w:p>
+            <w:pPr>
+              <w:pStyle w:val="Compact"/>
+            </w:pPr>
+            <w:r>
+              <w:t xml:space="preserve">zero offsets</w:t>
+            </w:r>
+          </w:p>
+        </w:tc>
+        <w:tc>
+          <w:tcPr/>
+          <w:p>
+            <w:pPr>
+              <w:pStyle w:val="Compact"/>
+            </w:pPr>
+            <w:r>
+              <w:t xml:space="preserve">1,800</w:t>
+            </w:r>
+          </w:p>
+        </w:tc>
+        <w:tc>
+          <w:tcPr/>
+          <w:p>
+            <w:pPr>
+              <w:pStyle w:val="Compact"/>
+            </w:pPr>
+            <w:r>
+              <w:t xml:space="preserve">0.53 [0.37, 0.70]</w:t>
+            </w:r>
+          </w:p>
+        </w:tc>
+        <w:tc>
+          <w:tcPr/>
+          <w:p>
+            <w:pPr>
+              <w:pStyle w:val="Compact"/>
+            </w:pPr>
+            <w:r>
+              <w:t xml:space="preserve">0.00 [0.00, 0.00]</w:t>
+            </w:r>
+          </w:p>
+        </w:tc>
+        <w:tc>
+          <w:tcPr/>
+          <w:p>
+            <w:pPr>
+              <w:pStyle w:val="Compact"/>
+            </w:pPr>
+            <w:r>
+              <w:t xml:space="preserve">0.62 [0.45, 0.79]</w:t>
+            </w:r>
+          </w:p>
+        </w:tc>
+        <w:tc>
+          <w:tcPr/>
+          <w:p>
+            <w:pPr>
+              <w:pStyle w:val="Compact"/>
+            </w:pPr>
+            <w:r>
+              <w:t xml:space="preserve">0.00 [0.00, 0.00]</w:t>
+            </w:r>
+          </w:p>
+        </w:tc>
+        <w:tc>
+          <w:tcPr/>
+          <w:p>
+            <w:pPr>
+              <w:pStyle w:val="Compact"/>
+            </w:pPr>
+            <w:r>
+              <w:t xml:space="preserve">27</w:t>
+            </w:r>
+          </w:p>
+        </w:tc>
+        <w:tc>
+          <w:tcPr/>
+          <w:p>
+            <w:pPr>
+              <w:pStyle w:val="Compact"/>
+            </w:pPr>
+            <w:r>
+              <w:t xml:space="preserve">4</w:t>
+            </w:r>
+          </w:p>
+        </w:tc>
+      </w:tr>
+      <w:tr>
+        <w:tc>
+          <w:tcPr/>
+          <w:p>
+            <w:pPr>
+              <w:pStyle w:val="Compact"/>
+            </w:pPr>
+            <w:r>
+              <w:t xml:space="preserve">refitted pressure series</w:t>
+            </w:r>
+          </w:p>
+        </w:tc>
+        <w:tc>
+          <w:tcPr/>
+          <w:p>
+            <w:pPr>
+              <w:pStyle w:val="Compact"/>
+            </w:pPr>
+            <w:r>
+              <w:t xml:space="preserve">500</w:t>
+            </w:r>
+          </w:p>
+        </w:tc>
+        <w:tc>
+          <w:tcPr/>
+          <w:p>
+            <w:pPr>
+              <w:pStyle w:val="Compact"/>
+            </w:pPr>
+            <w:r>
+              <w:t xml:space="preserve">0.53 [0.37, 0.70]</w:t>
+            </w:r>
+          </w:p>
+        </w:tc>
+        <w:tc>
+          <w:tcPr/>
+          <w:p>
+            <w:pPr>
+              <w:pStyle w:val="Compact"/>
+            </w:pPr>
+            <w:r>
+              <w:t xml:space="preserve">0.00 [0.00, 0.00]</w:t>
+            </w:r>
+          </w:p>
+        </w:tc>
+        <w:tc>
+          <w:tcPr/>
+          <w:p>
+            <w:pPr>
+              <w:pStyle w:val="Compact"/>
+            </w:pPr>
+            <w:r>
+              <w:t xml:space="preserve">0.62 [0.46, 0.79]</w:t>
+            </w:r>
+          </w:p>
+        </w:tc>
+        <w:tc>
+          <w:tcPr/>
+          <w:p>
+            <w:pPr>
+              <w:pStyle w:val="Compact"/>
+            </w:pPr>
+            <w:r>
+              <w:t xml:space="preserve">0.00 [0.00, +0.01]</w:t>
+            </w:r>
+          </w:p>
+        </w:tc>
+        <w:tc>
+          <w:tcPr/>
+          <w:p>
+            <w:pPr>
+              <w:pStyle w:val="Compact"/>
+            </w:pPr>
+            <w:r>
+              <w:t xml:space="preserve">27</w:t>
+            </w:r>
+          </w:p>
+        </w:tc>
+        <w:tc>
+          <w:tcPr/>
+          <w:p>
+            <w:pPr>
+              <w:pStyle w:val="Compact"/>
+            </w:pPr>
+            <w:r>
+              <w:t xml:space="preserve">1</w:t>
+            </w:r>
+          </w:p>
+        </w:tc>
+      </w:tr>
+    </w:tbl>
+    <w:p>
+      <w:pPr>
+        <w:pStyle w:val="BodyText"/>
+      </w:pPr>
+      <w:r>
+        <w:rPr>
+          <w:b/>
+          <w:bCs/>
+        </w:rPr>
+        <w:t xml:space="preserve">Table S18d</w:t>
+      </w:r>
+      <w:r>
+        <w:t xml:space="preserve"> </w:t>
+      </w:r>
+      <w:r>
+        <w:t xml:space="preserve">The refitted patterns, before → after. Ranks as in Table S18 (</w:t>
+      </w:r>
+      <w:r>
+        <w:t xml:space="preserve">‘–’</w:t>
+      </w:r>
+      <w:r>
+        <w:t xml:space="preserve">: the answer is not in the shortlist;</w:t>
+      </w:r>
+      <w:r>
+        <w:t xml:space="preserve"> </w:t>
+      </w:r>
+      <w:r>
+        <w:t xml:space="preserve">‘n/a’</w:t>
+      </w:r>
+      <w:r>
+        <w:t xml:space="preserve">: no injection, the answer is in the shortlist).</w:t>
+      </w:r>
+    </w:p>
+    <w:tbl>
+      <w:tblPr>
+        <w:tblStyle w:val="Table"/>
+        <w:tblW w:type="pct" w:w="5000"/>
+        <w:tblLayout w:type="fixed"/>
+        <w:tblLook w:firstRow="1" w:lastRow="0" w:firstColumn="0" w:lastColumn="0" w:noHBand="0" w:noVBand="0" w:val="0020"/>
+      </w:tblPr>
+      <w:tblGrid>
+        <w:gridCol w:w="990"/>
+        <w:gridCol w:w="990"/>
+        <w:gridCol w:w="990"/>
+        <w:gridCol w:w="990"/>
+        <w:gridCol w:w="990"/>
+        <w:gridCol w:w="990"/>
+        <w:gridCol w:w="990"/>
+        <w:gridCol w:w="990"/>
+      </w:tblGrid>
+      <w:tr>
+        <w:trPr>
+          <w:tblHeader w:val="on"/>
+        </w:trPr>
+        <w:tc>
+          <w:tcPr/>
+          <w:p>
+            <w:pPr>
+              <w:pStyle w:val="Compact"/>
+            </w:pPr>
+            <w:r>
+              <w:t xml:space="preserve">opXRD pattern</w:t>
+            </w:r>
+          </w:p>
+        </w:tc>
+        <w:tc>
+          <w:tcPr/>
+          <w:p>
+            <w:pPr>
+              <w:pStyle w:val="Compact"/>
+            </w:pPr>
+            <w:r>
+              <w:t xml:space="preserve">CSD family</w:t>
+            </w:r>
+          </w:p>
+        </w:tc>
+        <w:tc>
+          <w:tcPr/>
+          <w:p>
+            <w:pPr>
+              <w:pStyle w:val="Compact"/>
+            </w:pPr>
+            <w:r>
+              <w:t xml:space="preserve">own entry</w:t>
+            </w:r>
+          </w:p>
+        </w:tc>
+        <w:tc>
+          <w:tcPr/>
+          <w:p>
+            <w:pPr>
+              <w:pStyle w:val="Compact"/>
+            </w:pPr>
+            <w:r>
+              <w:t xml:space="preserve">peaks</w:t>
+            </w:r>
+          </w:p>
+        </w:tc>
+        <w:tc>
+          <w:tcPr/>
+          <w:p>
+            <w:pPr>
+              <w:pStyle w:val="Compact"/>
+            </w:pPr>
+            <w:r>
+              <w:t xml:space="preserve">own entry DIFF</w:t>
+            </w:r>
+          </w:p>
+        </w:tc>
+        <w:tc>
+          <w:tcPr/>
+          <w:p>
+            <w:pPr>
+              <w:pStyle w:val="Compact"/>
+            </w:pPr>
+            <w:r>
+              <w:t xml:space="preserve">own entry, rank among wrong entries</w:t>
+            </w:r>
+          </w:p>
+        </w:tc>
+        <w:tc>
+          <w:tcPr/>
+          <w:p>
+            <w:pPr>
+              <w:pStyle w:val="Compact"/>
+            </w:pPr>
+            <w:r>
+              <w:t xml:space="preserve">injected answer, rank</w:t>
+            </w:r>
+          </w:p>
+        </w:tc>
+        <w:tc>
+          <w:tcPr/>
+          <w:p>
+            <w:pPr>
+              <w:pStyle w:val="Compact"/>
+            </w:pPr>
+            <w:r>
+              <w:t xml:space="preserve">rank after the re-rank</w:t>
+            </w:r>
+          </w:p>
+        </w:tc>
+      </w:tr>
+      <w:tr>
+        <w:tc>
+          <w:tcPr/>
+          <w:p>
+            <w:pPr>
+              <w:pStyle w:val="Compact"/>
+            </w:pPr>
+            <w:r>
+              <w:t xml:space="preserve">pattern_730</w:t>
+            </w:r>
+          </w:p>
+        </w:tc>
+        <w:tc>
+          <w:tcPr/>
+          <w:p>
+            <w:pPr>
+              <w:pStyle w:val="Compact"/>
+            </w:pPr>
+            <w:r>
+              <w:t xml:space="preserve">EPIVEF</w:t>
+            </w:r>
+          </w:p>
+        </w:tc>
+        <w:tc>
+          <w:tcPr/>
+          <w:p>
+            <w:pPr>
+              <w:pStyle w:val="Compact"/>
+            </w:pPr>
+            <w:r>
+              <w:t xml:space="preserve">EPIVEF02</w:t>
+            </w:r>
+          </w:p>
+        </w:tc>
+        <w:tc>
+          <w:tcPr/>
+          <w:p>
+            <w:pPr>
+              <w:pStyle w:val="Compact"/>
+            </w:pPr>
+            <w:r>
+              <w:t xml:space="preserve">24 → 43</w:t>
+            </w:r>
+          </w:p>
+        </w:tc>
+        <w:tc>
+          <w:tcPr/>
+          <w:p>
+            <w:pPr>
+              <w:pStyle w:val="Compact"/>
+            </w:pPr>
+            <w:r>
+              <w:t xml:space="preserve">0.427 → 0.022</w:t>
+            </w:r>
+          </w:p>
+        </w:tc>
+        <w:tc>
+          <w:tcPr/>
+          <w:p>
+            <w:pPr>
+              <w:pStyle w:val="Compact"/>
+            </w:pPr>
+            <w:r>
+              <w:t xml:space="preserve">50 → 1</w:t>
+            </w:r>
+          </w:p>
+        </w:tc>
+        <w:tc>
+          <w:tcPr/>
+          <w:p>
+            <w:pPr>
+              <w:pStyle w:val="Compact"/>
+            </w:pPr>
+            <w:r>
+              <w:t xml:space="preserve">50 → 1</w:t>
+            </w:r>
+          </w:p>
+        </w:tc>
+        <w:tc>
+          <w:tcPr/>
+          <w:p>
+            <w:pPr>
+              <w:pStyle w:val="Compact"/>
+            </w:pPr>
+            <w:r>
+              <w:t xml:space="preserve">– → –</w:t>
+            </w:r>
+          </w:p>
+        </w:tc>
+      </w:tr>
+      <w:tr>
+        <w:tc>
+          <w:tcPr/>
+          <w:p>
+            <w:pPr>
+              <w:pStyle w:val="Compact"/>
+            </w:pPr>
+            <w:r>
+              <w:t xml:space="preserve">pattern_921</w:t>
+            </w:r>
+          </w:p>
+        </w:tc>
+        <w:tc>
+          <w:tcPr/>
+          <w:p>
+            <w:pPr>
+              <w:pStyle w:val="Compact"/>
+            </w:pPr>
+            <w:r>
+              <w:t xml:space="preserve">EPIVEF</w:t>
+            </w:r>
+          </w:p>
+        </w:tc>
+        <w:tc>
+          <w:tcPr/>
+          <w:p>
+            <w:pPr>
+              <w:pStyle w:val="Compact"/>
+            </w:pPr>
+            <w:r>
+              <w:t xml:space="preserve">EPIVEF01</w:t>
+            </w:r>
+          </w:p>
+        </w:tc>
+        <w:tc>
+          <w:tcPr/>
+          <w:p>
+            <w:pPr>
+              <w:pStyle w:val="Compact"/>
+            </w:pPr>
+            <w:r>
+              <w:t xml:space="preserve">29 → 46</w:t>
+            </w:r>
+          </w:p>
+        </w:tc>
+        <w:tc>
+          <w:tcPr/>
+          <w:p>
+            <w:pPr>
+              <w:pStyle w:val="Compact"/>
+            </w:pPr>
+            <w:r>
+              <w:t xml:space="preserve">0.177 → 0.019</w:t>
+            </w:r>
+          </w:p>
+        </w:tc>
+        <w:tc>
+          <w:tcPr/>
+          <w:p>
+            <w:pPr>
+              <w:pStyle w:val="Compact"/>
+            </w:pPr>
+            <w:r>
+              <w:t xml:space="preserve">1 → 1</w:t>
+            </w:r>
+          </w:p>
+        </w:tc>
+        <w:tc>
+          <w:tcPr/>
+          <w:p>
+            <w:pPr>
+              <w:pStyle w:val="Compact"/>
+            </w:pPr>
+            <w:r>
+              <w:t xml:space="preserve">1 → 1</w:t>
+            </w:r>
+          </w:p>
+        </w:tc>
+        <w:tc>
+          <w:tcPr/>
+          <w:p>
+            <w:pPr>
+              <w:pStyle w:val="Compact"/>
+            </w:pPr>
+            <w:r>
+              <w:t xml:space="preserve">– → –</w:t>
+            </w:r>
+          </w:p>
+        </w:tc>
+      </w:tr>
+      <w:tr>
+        <w:tc>
+          <w:tcPr/>
+          <w:p>
+            <w:pPr>
+              <w:pStyle w:val="Compact"/>
+            </w:pPr>
+            <w:r>
+              <w:t xml:space="preserve">pattern_760</w:t>
+            </w:r>
+          </w:p>
+        </w:tc>
+        <w:tc>
+          <w:tcPr/>
+          <w:p>
+            <w:pPr>
+              <w:pStyle w:val="Compact"/>
+            </w:pPr>
+            <w:r>
+              <w:t xml:space="preserve">LILRIJ</w:t>
+            </w:r>
+          </w:p>
+        </w:tc>
+        <w:tc>
+          <w:tcPr/>
+          <w:p>
+            <w:pPr>
+              <w:pStyle w:val="Compact"/>
+            </w:pPr>
+            <w:r>
+              <w:t xml:space="preserve">LILRIJ01</w:t>
+            </w:r>
+          </w:p>
+        </w:tc>
+        <w:tc>
+          <w:tcPr/>
+          <w:p>
+            <w:pPr>
+              <w:pStyle w:val="Compact"/>
+            </w:pPr>
+            <w:r>
+              <w:t xml:space="preserve">11 → 40</w:t>
+            </w:r>
+          </w:p>
+        </w:tc>
+        <w:tc>
+          <w:tcPr/>
+          <w:p>
+            <w:pPr>
+              <w:pStyle w:val="Compact"/>
+            </w:pPr>
+            <w:r>
+              <w:t xml:space="preserve">0.256 → 0.053</w:t>
+            </w:r>
+          </w:p>
+        </w:tc>
+        <w:tc>
+          <w:tcPr/>
+          <w:p>
+            <w:pPr>
+              <w:pStyle w:val="Compact"/>
+            </w:pPr>
+            <w:r>
+              <w:t xml:space="preserve">32 → 10</w:t>
+            </w:r>
+          </w:p>
+        </w:tc>
+        <w:tc>
+          <w:tcPr/>
+          <w:p>
+            <w:pPr>
+              <w:pStyle w:val="Compact"/>
+            </w:pPr>
+            <w:r>
+              <w:t xml:space="preserve">40 → 6</w:t>
+            </w:r>
+          </w:p>
+        </w:tc>
+        <w:tc>
+          <w:tcPr/>
+          <w:p>
+            <w:pPr>
+              <w:pStyle w:val="Compact"/>
+            </w:pPr>
+            <w:r>
+              <w:t xml:space="preserve">– → –</w:t>
+            </w:r>
+          </w:p>
+        </w:tc>
+      </w:tr>
+      <w:tr>
+        <w:tc>
+          <w:tcPr/>
+          <w:p>
+            <w:pPr>
+              <w:pStyle w:val="Compact"/>
+            </w:pPr>
+            <w:r>
+              <w:t xml:space="preserve">pattern_213</w:t>
+            </w:r>
+          </w:p>
+        </w:tc>
+        <w:tc>
+          <w:tcPr/>
+          <w:p>
+            <w:pPr>
+              <w:pStyle w:val="Compact"/>
+            </w:pPr>
+            <w:r>
+              <w:t xml:space="preserve">MEHNIY</w:t>
+            </w:r>
+          </w:p>
+        </w:tc>
+        <w:tc>
+          <w:tcPr/>
+          <w:p>
+            <w:pPr>
+              <w:pStyle w:val="Compact"/>
+            </w:pPr>
+            <w:r>
+              <w:t xml:space="preserve">MEHNIY07</w:t>
+            </w:r>
+          </w:p>
+        </w:tc>
+        <w:tc>
+          <w:tcPr/>
+          <w:p>
+            <w:pPr>
+              <w:pStyle w:val="Compact"/>
+            </w:pPr>
+            <w:r>
+              <w:t xml:space="preserve">11 → 54</w:t>
+            </w:r>
+          </w:p>
+        </w:tc>
+        <w:tc>
+          <w:tcPr/>
+          <w:p>
+            <w:pPr>
+              <w:pStyle w:val="Compact"/>
+            </w:pPr>
+            <w:r>
+              <w:t xml:space="preserve">0.227 → 0.044</w:t>
+            </w:r>
+          </w:p>
+        </w:tc>
+        <w:tc>
+          <w:tcPr/>
+          <w:p>
+            <w:pPr>
+              <w:pStyle w:val="Compact"/>
+            </w:pPr>
+            <w:r>
+              <w:t xml:space="preserve">49 → 1</w:t>
+            </w:r>
+          </w:p>
+        </w:tc>
+        <w:tc>
+          <w:tcPr/>
+          <w:p>
+            <w:pPr>
+              <w:pStyle w:val="Compact"/>
+            </w:pPr>
+            <w:r>
+              <w:t xml:space="preserve">37 → 15</w:t>
+            </w:r>
+          </w:p>
+        </w:tc>
+        <w:tc>
+          <w:tcPr/>
+          <w:p>
+            <w:pPr>
+              <w:pStyle w:val="Compact"/>
+            </w:pPr>
+            <w:r>
+              <w:t xml:space="preserve">– → –</w:t>
+            </w:r>
+          </w:p>
+        </w:tc>
+      </w:tr>
+      <w:tr>
+        <w:tc>
+          <w:tcPr/>
+          <w:p>
+            <w:pPr>
+              <w:pStyle w:val="Compact"/>
+            </w:pPr>
+            <w:r>
+              <w:t xml:space="preserve">pattern_594</w:t>
+            </w:r>
+          </w:p>
+        </w:tc>
+        <w:tc>
+          <w:tcPr/>
+          <w:p>
+            <w:pPr>
+              <w:pStyle w:val="Compact"/>
+            </w:pPr>
+            <w:r>
+              <w:t xml:space="preserve">MEHNIY</w:t>
+            </w:r>
+          </w:p>
+        </w:tc>
+        <w:tc>
+          <w:tcPr/>
+          <w:p>
+            <w:pPr>
+              <w:pStyle w:val="Compact"/>
+            </w:pPr>
+            <w:r>
+              <w:t xml:space="preserve">MEHNIY01</w:t>
+            </w:r>
+          </w:p>
+        </w:tc>
+        <w:tc>
+          <w:tcPr/>
+          <w:p>
+            <w:pPr>
+              <w:pStyle w:val="Compact"/>
+            </w:pPr>
+            <w:r>
+              <w:t xml:space="preserve">18 → 59</w:t>
+            </w:r>
+          </w:p>
+        </w:tc>
+        <w:tc>
+          <w:tcPr/>
+          <w:p>
+            <w:pPr>
+              <w:pStyle w:val="Compact"/>
+            </w:pPr>
+            <w:r>
+              <w:t xml:space="preserve">0.368 → 0.013</w:t>
+            </w:r>
+          </w:p>
+        </w:tc>
+        <w:tc>
+          <w:tcPr/>
+          <w:p>
+            <w:pPr>
+              <w:pStyle w:val="Compact"/>
+            </w:pPr>
+            <w:r>
+              <w:t xml:space="preserve">21 → 2</w:t>
+            </w:r>
+          </w:p>
+        </w:tc>
+        <w:tc>
+          <w:tcPr/>
+          <w:p>
+            <w:pPr>
+              <w:pStyle w:val="Compact"/>
+            </w:pPr>
+            <w:r>
+              <w:t xml:space="preserve">n/a</w:t>
+            </w:r>
+          </w:p>
+        </w:tc>
+        <w:tc>
+          <w:tcPr/>
+          <w:p>
+            <w:pPr>
+              <w:pStyle w:val="Compact"/>
+            </w:pPr>
+            <w:r>
+              <w:t xml:space="preserve">22 → 2</w:t>
+            </w:r>
+          </w:p>
+        </w:tc>
+      </w:tr>
+      <w:tr>
+        <w:tc>
+          <w:tcPr/>
+          <w:p>
+            <w:pPr>
+              <w:pStyle w:val="Compact"/>
+            </w:pPr>
+            <w:r>
+              <w:t xml:space="preserve">pattern_623</w:t>
+            </w:r>
+          </w:p>
+        </w:tc>
+        <w:tc>
+          <w:tcPr/>
+          <w:p>
+            <w:pPr>
+              <w:pStyle w:val="Compact"/>
+            </w:pPr>
+            <w:r>
+              <w:t xml:space="preserve">MEHNIY</w:t>
+            </w:r>
+          </w:p>
+        </w:tc>
+        <w:tc>
+          <w:tcPr/>
+          <w:p>
+            <w:pPr>
+              <w:pStyle w:val="Compact"/>
+            </w:pPr>
+            <w:r>
+              <w:t xml:space="preserve">MEHNIY04</w:t>
+            </w:r>
+          </w:p>
+        </w:tc>
+        <w:tc>
+          <w:tcPr/>
+          <w:p>
+            <w:pPr>
+              <w:pStyle w:val="Compact"/>
+            </w:pPr>
+            <w:r>
+              <w:t xml:space="preserve">12 → 51</w:t>
+            </w:r>
+          </w:p>
+        </w:tc>
+        <w:tc>
+          <w:tcPr/>
+          <w:p>
+            <w:pPr>
+              <w:pStyle w:val="Compact"/>
+            </w:pPr>
+            <w:r>
+              <w:t xml:space="preserve">0.509 → 0.015</w:t>
+            </w:r>
+          </w:p>
+        </w:tc>
+        <w:tc>
+          <w:tcPr/>
+          <w:p>
+            <w:pPr>
+              <w:pStyle w:val="Compact"/>
+            </w:pPr>
+            <w:r>
+              <w:t xml:space="preserve">11 → 2</w:t>
+            </w:r>
+          </w:p>
+        </w:tc>
+        <w:tc>
+          <w:tcPr/>
+          <w:p>
+            <w:pPr>
+              <w:pStyle w:val="Compact"/>
+            </w:pPr>
+            <w:r>
+              <w:t xml:space="preserve">12 → 3</w:t>
+            </w:r>
+          </w:p>
+        </w:tc>
+        <w:tc>
+          <w:tcPr/>
+          <w:p>
+            <w:pPr>
+              <w:pStyle w:val="Compact"/>
+            </w:pPr>
+            <w:r>
+              <w:t xml:space="preserve">– → –</w:t>
+            </w:r>
+          </w:p>
+        </w:tc>
+      </w:tr>
+      <w:tr>
+        <w:tc>
+          <w:tcPr/>
+          <w:p>
+            <w:pPr>
+              <w:pStyle w:val="Compact"/>
+            </w:pPr>
+            <w:r>
+              <w:t xml:space="preserve">pattern_875</w:t>
+            </w:r>
+          </w:p>
+        </w:tc>
+        <w:tc>
+          <w:tcPr/>
+          <w:p>
+            <w:pPr>
+              <w:pStyle w:val="Compact"/>
+            </w:pPr>
+            <w:r>
+              <w:t xml:space="preserve">MEHNIY</w:t>
+            </w:r>
+          </w:p>
+        </w:tc>
+        <w:tc>
+          <w:tcPr/>
+          <w:p>
+            <w:pPr>
+              <w:pStyle w:val="Compact"/>
+            </w:pPr>
+            <w:r>
+              <w:t xml:space="preserve">MEHNIY05</w:t>
+            </w:r>
+          </w:p>
+        </w:tc>
+        <w:tc>
+          <w:tcPr/>
+          <w:p>
+            <w:pPr>
+              <w:pStyle w:val="Compact"/>
+            </w:pPr>
+            <w:r>
+              <w:t xml:space="preserve">11 → 50</w:t>
+            </w:r>
+          </w:p>
+        </w:tc>
+        <w:tc>
+          <w:tcPr/>
+          <w:p>
+            <w:pPr>
+              <w:pStyle w:val="Compact"/>
+            </w:pPr>
+            <w:r>
+              <w:t xml:space="preserve">0.354 → 0.016</w:t>
+            </w:r>
+          </w:p>
+        </w:tc>
+        <w:tc>
+          <w:tcPr/>
+          <w:p>
+            <w:pPr>
+              <w:pStyle w:val="Compact"/>
+            </w:pPr>
+            <w:r>
+              <w:t xml:space="preserve">14 → 1</w:t>
+            </w:r>
+          </w:p>
+        </w:tc>
+        <w:tc>
+          <w:tcPr/>
+          <w:p>
+            <w:pPr>
+              <w:pStyle w:val="Compact"/>
+            </w:pPr>
+            <w:r>
+              <w:t xml:space="preserve">25 → 1</w:t>
+            </w:r>
+          </w:p>
+        </w:tc>
+        <w:tc>
+          <w:tcPr/>
+          <w:p>
+            <w:pPr>
+              <w:pStyle w:val="Compact"/>
+            </w:pPr>
+            <w:r>
+              <w:t xml:space="preserve">– → –</w:t>
+            </w:r>
+          </w:p>
+        </w:tc>
+      </w:tr>
+      <w:tr>
+        <w:tc>
+          <w:tcPr/>
+          <w:p>
+            <w:pPr>
+              <w:pStyle w:val="Compact"/>
+            </w:pPr>
+            <w:r>
+              <w:t xml:space="preserve">pattern_891</w:t>
+            </w:r>
+          </w:p>
+        </w:tc>
+        <w:tc>
+          <w:tcPr/>
+          <w:p>
+            <w:pPr>
+              <w:pStyle w:val="Compact"/>
+            </w:pPr>
+            <w:r>
+              <w:t xml:space="preserve">MEHNIY</w:t>
+            </w:r>
+          </w:p>
+        </w:tc>
+        <w:tc>
+          <w:tcPr/>
+          <w:p>
+            <w:pPr>
+              <w:pStyle w:val="Compact"/>
+            </w:pPr>
+            <w:r>
+              <w:t xml:space="preserve">MEHNIY06</w:t>
+            </w:r>
+          </w:p>
+        </w:tc>
+        <w:tc>
+          <w:tcPr/>
+          <w:p>
+            <w:pPr>
+              <w:pStyle w:val="Compact"/>
+            </w:pPr>
+            <w:r>
+              <w:t xml:space="preserve">13 → 60</w:t>
+            </w:r>
+          </w:p>
+        </w:tc>
+        <w:tc>
+          <w:tcPr/>
+          <w:p>
+            <w:pPr>
+              <w:pStyle w:val="Compact"/>
+            </w:pPr>
+            <w:r>
+              <w:t xml:space="preserve">0.488 → 0.022</w:t>
+            </w:r>
+          </w:p>
+        </w:tc>
+        <w:tc>
+          <w:tcPr/>
+          <w:p>
+            <w:pPr>
+              <w:pStyle w:val="Compact"/>
+            </w:pPr>
+            <w:r>
+              <w:t xml:space="preserve">10 → 1</w:t>
+            </w:r>
+          </w:p>
+        </w:tc>
+        <w:tc>
+          <w:tcPr/>
+          <w:p>
+            <w:pPr>
+              <w:pStyle w:val="Compact"/>
+            </w:pPr>
+            <w:r>
+              <w:t xml:space="preserve">10 → 1</w:t>
+            </w:r>
+          </w:p>
+        </w:tc>
+        <w:tc>
+          <w:tcPr/>
+          <w:p>
+            <w:pPr>
+              <w:pStyle w:val="Compact"/>
+            </w:pPr>
+            <w:r>
+              <w:t xml:space="preserve">– → –</w:t>
+            </w:r>
+          </w:p>
+        </w:tc>
+      </w:tr>
+      <w:tr>
+        <w:tc>
+          <w:tcPr/>
+          <w:p>
+            <w:pPr>
+              <w:pStyle w:val="Compact"/>
+            </w:pPr>
+            <w:r>
+              <w:t xml:space="preserve">pattern_978</w:t>
+            </w:r>
+          </w:p>
+        </w:tc>
+        <w:tc>
+          <w:tcPr/>
+          <w:p>
+            <w:pPr>
+              <w:pStyle w:val="Compact"/>
+            </w:pPr>
+            <w:r>
+              <w:t xml:space="preserve">MEHNIY</w:t>
+            </w:r>
+          </w:p>
+        </w:tc>
+        <w:tc>
+          <w:tcPr/>
+          <w:p>
+            <w:pPr>
+              <w:pStyle w:val="Compact"/>
+            </w:pPr>
+            <w:r>
+              <w:t xml:space="preserve">MEHNIY03</w:t>
+            </w:r>
+          </w:p>
+        </w:tc>
+        <w:tc>
+          <w:tcPr/>
+          <w:p>
+            <w:pPr>
+              <w:pStyle w:val="Compact"/>
+            </w:pPr>
+            <w:r>
+              <w:t xml:space="preserve">15 → 52</w:t>
+            </w:r>
+          </w:p>
+        </w:tc>
+        <w:tc>
+          <w:tcPr/>
+          <w:p>
+            <w:pPr>
+              <w:pStyle w:val="Compact"/>
+            </w:pPr>
+            <w:r>
+              <w:t xml:space="preserve">0.495 → 0.011</w:t>
+            </w:r>
+          </w:p>
+        </w:tc>
+        <w:tc>
+          <w:tcPr/>
+          <w:p>
+            <w:pPr>
+              <w:pStyle w:val="Compact"/>
+            </w:pPr>
+            <w:r>
+              <w:t xml:space="preserve">17 → 1</w:t>
+            </w:r>
+          </w:p>
+        </w:tc>
+        <w:tc>
+          <w:tcPr/>
+          <w:p>
+            <w:pPr>
+              <w:pStyle w:val="Compact"/>
+            </w:pPr>
+            <w:r>
+              <w:t xml:space="preserve">29 → 4</w:t>
+            </w:r>
+          </w:p>
+        </w:tc>
+        <w:tc>
+          <w:tcPr/>
+          <w:p>
+            <w:pPr>
+              <w:pStyle w:val="Compact"/>
+            </w:pPr>
+            <w:r>
+              <w:t xml:space="preserve">– → –</w:t>
+            </w:r>
+          </w:p>
+        </w:tc>
+      </w:tr>
+      <w:tr>
+        <w:tc>
+          <w:tcPr/>
+          <w:p>
+            <w:pPr>
+              <w:pStyle w:val="Compact"/>
+            </w:pPr>
+            <w:r>
+              <w:t xml:space="preserve">pattern_1010</w:t>
+            </w:r>
+          </w:p>
+        </w:tc>
+        <w:tc>
+          <w:tcPr/>
+          <w:p>
+            <w:pPr>
+              <w:pStyle w:val="Compact"/>
+            </w:pPr>
+            <w:r>
+              <w:t xml:space="preserve">MEHNIY</w:t>
+            </w:r>
+          </w:p>
+        </w:tc>
+        <w:tc>
+          <w:tcPr/>
+          <w:p>
+            <w:pPr>
+              <w:pStyle w:val="Compact"/>
+            </w:pPr>
+            <w:r>
+              <w:t xml:space="preserve">MEHNIY02</w:t>
+            </w:r>
+          </w:p>
+        </w:tc>
+        <w:tc>
+          <w:tcPr/>
+          <w:p>
+            <w:pPr>
+              <w:pStyle w:val="Compact"/>
+            </w:pPr>
+            <w:r>
+              <w:t xml:space="preserve">12 → 51</w:t>
+            </w:r>
+          </w:p>
+        </w:tc>
+        <w:tc>
+          <w:tcPr/>
+          <w:p>
+            <w:pPr>
+              <w:pStyle w:val="Compact"/>
+            </w:pPr>
+            <w:r>
+              <w:t xml:space="preserve">0.290 → 0.010</w:t>
+            </w:r>
+          </w:p>
+        </w:tc>
+        <w:tc>
+          <w:tcPr/>
+          <w:p>
+            <w:pPr>
+              <w:pStyle w:val="Compact"/>
+            </w:pPr>
+            <w:r>
+              <w:t xml:space="preserve">2 → 1</w:t>
+            </w:r>
+          </w:p>
+        </w:tc>
+        <w:tc>
+          <w:tcPr/>
+          <w:p>
+            <w:pPr>
+              <w:pStyle w:val="Compact"/>
+            </w:pPr>
+            <w:r>
+              <w:t xml:space="preserve">2 → 1</w:t>
+            </w:r>
+          </w:p>
+        </w:tc>
+        <w:tc>
+          <w:tcPr/>
+          <w:p>
+            <w:pPr>
+              <w:pStyle w:val="Compact"/>
+            </w:pPr>
+            <w:r>
+              <w:t xml:space="preserve">– → –</w:t>
+            </w:r>
+          </w:p>
+        </w:tc>
+      </w:tr>
+    </w:tbl>
+    <w:p>
+      <w:pPr>
+        <w:pStyle w:val="BodyText"/>
+      </w:pPr>
+      <w:r>
+        <w:t xml:space="preserve">Own entry ranked first: 1 → 7 of 10; median own-entry DIFF 0.361 → 0.018. Injected answer ranked first: 1 → 5 of 9.</w:t>
+      </w:r>
+    </w:p>
     <w:bookmarkEnd w:id="19"/>
-    <w:bookmarkStart w:id="20" w:name="s11-effect-ladder"/>
+    <w:bookmarkEnd w:id="20"/>
+    <w:bookmarkStart w:id="21" w:name="s11-effect-ladder"/>
     <w:p>
       <w:pPr>
         <w:pStyle w:val="Heading2"/>
@@ -24592,8 +26065,8 @@
         </w:tc>
       </w:tr>
     </w:tbl>
-    <w:bookmarkEnd w:id="20"/>
-    <w:bookmarkStart w:id="21" w:name="s12-a-library-closer-to-the-measurements"/>
+    <w:bookmarkEnd w:id="21"/>
+    <w:bookmarkStart w:id="22" w:name="s12-a-library-closer-to-the-measurements"/>
     <w:p>
       <w:pPr>
         <w:pStyle w:val="Heading2"/>
@@ -25963,8 +27436,929 @@
         </w:tc>
       </w:tr>
     </w:tbl>
-    <w:bookmarkEnd w:id="21"/>
-    <w:bookmarkStart w:id="22" w:name="s13-the-open-replica-cod"/>
+    <w:p>
+      <w:pPr>
+        <w:pStyle w:val="BodyText"/>
+      </w:pPr>
+      <w:r>
+        <w:rPr>
+          <w:b/>
+          <w:bCs/>
+        </w:rPr>
+        <w:t xml:space="preserve">Table S21b</w:t>
+      </w:r>
+      <w:r>
+        <w:t xml:space="preserve"> </w:t>
+      </w:r>
+      <w:r>
+        <w:t xml:space="preserve">Measured patterns put on the Cu grid by averaging over each 0.02° grid step instead of interpolating (the design and a decision rule were fixed before the run: a change above 0.05 would have made it the primary preprocessing). Compound-weighted top-1, paired against the main benchmark; first places that change.</w:t>
+      </w:r>
+    </w:p>
+    <w:tbl>
+      <w:tblPr>
+        <w:tblStyle w:val="Table"/>
+        <w:tblW w:type="pct" w:w="5000"/>
+        <w:tblLayout w:type="fixed"/>
+        <w:tblLook w:firstRow="1" w:lastRow="0" w:firstColumn="0" w:lastColumn="0" w:noHBand="0" w:noVBand="0" w:val="0020"/>
+      </w:tblPr>
+      <w:tblGrid>
+        <w:gridCol w:w="1320"/>
+        <w:gridCol w:w="1320"/>
+        <w:gridCol w:w="1320"/>
+        <w:gridCol w:w="1320"/>
+        <w:gridCol w:w="1320"/>
+        <w:gridCol w:w="1320"/>
+      </w:tblGrid>
+      <w:tr>
+        <w:trPr>
+          <w:tblHeader w:val="on"/>
+        </w:trPr>
+        <w:tc>
+          <w:tcPr/>
+          <w:p>
+            <w:pPr>
+              <w:pStyle w:val="Compact"/>
+            </w:pPr>
+            <w:r>
+              <w:t xml:space="preserve">score</w:t>
+            </w:r>
+          </w:p>
+        </w:tc>
+        <w:tc>
+          <w:tcPr/>
+          <w:p>
+            <w:pPr>
+              <w:pStyle w:val="Compact"/>
+            </w:pPr>
+            <w:r>
+              <w:t xml:space="preserve">answer set</w:t>
+            </w:r>
+          </w:p>
+        </w:tc>
+        <w:tc>
+          <w:tcPr/>
+          <w:p>
+            <w:pPr>
+              <w:pStyle w:val="Compact"/>
+            </w:pPr>
+            <w:r>
+              <w:t xml:space="preserve">main</w:t>
+            </w:r>
+          </w:p>
+        </w:tc>
+        <w:tc>
+          <w:tcPr/>
+          <w:p>
+            <w:pPr>
+              <w:pStyle w:val="Compact"/>
+            </w:pPr>
+            <w:r>
+              <w:t xml:space="preserve">bin-averaged</w:t>
+            </w:r>
+          </w:p>
+        </w:tc>
+        <w:tc>
+          <w:tcPr/>
+          <w:p>
+            <w:pPr>
+              <w:pStyle w:val="Compact"/>
+            </w:pPr>
+            <w:r>
+              <w:t xml:space="preserve">difference</w:t>
+            </w:r>
+          </w:p>
+        </w:tc>
+        <w:tc>
+          <w:tcPr/>
+          <w:p>
+            <w:pPr>
+              <w:pStyle w:val="Compact"/>
+            </w:pPr>
+            <w:r>
+              <w:t xml:space="preserve">first places changed</w:t>
+            </w:r>
+          </w:p>
+        </w:tc>
+      </w:tr>
+      <w:tr>
+        <w:tc>
+          <w:tcPr/>
+          <w:p>
+            <w:pPr>
+              <w:pStyle w:val="Compact"/>
+            </w:pPr>
+            <w:r>
+              <w:t xml:space="preserve">ln q lag + zero scan</w:t>
+            </w:r>
+          </w:p>
+        </w:tc>
+        <w:tc>
+          <w:tcPr/>
+          <w:p>
+            <w:pPr>
+              <w:pStyle w:val="Compact"/>
+            </w:pPr>
+            <w:r>
+              <w:t xml:space="preserve">any same-form</w:t>
+            </w:r>
+          </w:p>
+        </w:tc>
+        <w:tc>
+          <w:tcPr/>
+          <w:p>
+            <w:pPr>
+              <w:pStyle w:val="Compact"/>
+            </w:pPr>
+            <w:r>
+              <w:t xml:space="preserve">0.87</w:t>
+            </w:r>
+          </w:p>
+        </w:tc>
+        <w:tc>
+          <w:tcPr/>
+          <w:p>
+            <w:pPr>
+              <w:pStyle w:val="Compact"/>
+            </w:pPr>
+            <w:r>
+              <w:t xml:space="preserve">0.87 [0.82, 0.93]</w:t>
+            </w:r>
+          </w:p>
+        </w:tc>
+        <w:tc>
+          <w:tcPr/>
+          <w:p>
+            <w:pPr>
+              <w:pStyle w:val="Compact"/>
+            </w:pPr>
+            <w:r>
+              <w:t xml:space="preserve">0.00 [0.00, 0.00]</w:t>
+            </w:r>
+          </w:p>
+        </w:tc>
+        <w:tc>
+          <w:tcPr/>
+          <w:p>
+            <w:pPr>
+              <w:pStyle w:val="Compact"/>
+            </w:pPr>
+            <w:r>
+              <w:t xml:space="preserve">0</w:t>
+            </w:r>
+          </w:p>
+        </w:tc>
+      </w:tr>
+      <w:tr>
+        <w:tc>
+          <w:tcPr/>
+          <w:p>
+            <w:pPr>
+              <w:pStyle w:val="Compact"/>
+            </w:pPr>
+            <w:r>
+              <w:t xml:space="preserve">ln q lag + zero scan</w:t>
+            </w:r>
+          </w:p>
+        </w:tc>
+        <w:tc>
+          <w:tcPr/>
+          <w:p>
+            <w:pPr>
+              <w:pStyle w:val="Compact"/>
+            </w:pPr>
+            <w:r>
+              <w:t xml:space="preserve">single-crystal</w:t>
+            </w:r>
+          </w:p>
+        </w:tc>
+        <w:tc>
+          <w:tcPr/>
+          <w:p>
+            <w:pPr>
+              <w:pStyle w:val="Compact"/>
+            </w:pPr>
+            <w:r>
+              <w:t xml:space="preserve">0.45</w:t>
+            </w:r>
+          </w:p>
+        </w:tc>
+        <w:tc>
+          <w:tcPr/>
+          <w:p>
+            <w:pPr>
+              <w:pStyle w:val="Compact"/>
+            </w:pPr>
+            <w:r>
+              <w:t xml:space="preserve">0.45 [0.28, 0.63]</w:t>
+            </w:r>
+          </w:p>
+        </w:tc>
+        <w:tc>
+          <w:tcPr/>
+          <w:p>
+            <w:pPr>
+              <w:pStyle w:val="Compact"/>
+            </w:pPr>
+            <w:r>
+              <w:t xml:space="preserve">0.00 [0.00, 0.00]</w:t>
+            </w:r>
+          </w:p>
+        </w:tc>
+        <w:tc>
+          <w:tcPr/>
+          <w:p>
+            <w:pPr>
+              <w:pStyle w:val="Compact"/>
+            </w:pPr>
+            <w:r>
+              <w:t xml:space="preserve">0</w:t>
+            </w:r>
+          </w:p>
+        </w:tc>
+      </w:tr>
+      <w:tr>
+        <w:tc>
+          <w:tcPr/>
+          <w:p>
+            <w:pPr>
+              <w:pStyle w:val="Compact"/>
+            </w:pPr>
+            <w:r>
+              <w:t xml:space="preserve">Cosine + zero scan</w:t>
+            </w:r>
+          </w:p>
+        </w:tc>
+        <w:tc>
+          <w:tcPr/>
+          <w:p>
+            <w:pPr>
+              <w:pStyle w:val="Compact"/>
+            </w:pPr>
+            <w:r>
+              <w:t xml:space="preserve">any same-form</w:t>
+            </w:r>
+          </w:p>
+        </w:tc>
+        <w:tc>
+          <w:tcPr/>
+          <w:p>
+            <w:pPr>
+              <w:pStyle w:val="Compact"/>
+            </w:pPr>
+            <w:r>
+              <w:t xml:space="preserve">0.84</w:t>
+            </w:r>
+          </w:p>
+        </w:tc>
+        <w:tc>
+          <w:tcPr/>
+          <w:p>
+            <w:pPr>
+              <w:pStyle w:val="Compact"/>
+            </w:pPr>
+            <w:r>
+              <w:t xml:space="preserve">0.84 [0.78, 0.90]</w:t>
+            </w:r>
+          </w:p>
+        </w:tc>
+        <w:tc>
+          <w:tcPr/>
+          <w:p>
+            <w:pPr>
+              <w:pStyle w:val="Compact"/>
+            </w:pPr>
+            <w:r>
+              <w:t xml:space="preserve">0.00 [0.00, 0.00]</w:t>
+            </w:r>
+          </w:p>
+        </w:tc>
+        <w:tc>
+          <w:tcPr/>
+          <w:p>
+            <w:pPr>
+              <w:pStyle w:val="Compact"/>
+            </w:pPr>
+            <w:r>
+              <w:t xml:space="preserve">0</w:t>
+            </w:r>
+          </w:p>
+        </w:tc>
+      </w:tr>
+      <w:tr>
+        <w:tc>
+          <w:tcPr/>
+          <w:p>
+            <w:pPr>
+              <w:pStyle w:val="Compact"/>
+            </w:pPr>
+            <w:r>
+              <w:t xml:space="preserve">Cosine + zero scan</w:t>
+            </w:r>
+          </w:p>
+        </w:tc>
+        <w:tc>
+          <w:tcPr/>
+          <w:p>
+            <w:pPr>
+              <w:pStyle w:val="Compact"/>
+            </w:pPr>
+            <w:r>
+              <w:t xml:space="preserve">single-crystal</w:t>
+            </w:r>
+          </w:p>
+        </w:tc>
+        <w:tc>
+          <w:tcPr/>
+          <w:p>
+            <w:pPr>
+              <w:pStyle w:val="Compact"/>
+            </w:pPr>
+            <w:r>
+              <w:t xml:space="preserve">0.40</w:t>
+            </w:r>
+          </w:p>
+        </w:tc>
+        <w:tc>
+          <w:tcPr/>
+          <w:p>
+            <w:pPr>
+              <w:pStyle w:val="Compact"/>
+            </w:pPr>
+            <w:r>
+              <w:t xml:space="preserve">0.40 [0.24, 0.57]</w:t>
+            </w:r>
+          </w:p>
+        </w:tc>
+        <w:tc>
+          <w:tcPr/>
+          <w:p>
+            <w:pPr>
+              <w:pStyle w:val="Compact"/>
+            </w:pPr>
+            <w:r>
+              <w:t xml:space="preserve">0.00 [0.00, 0.00]</w:t>
+            </w:r>
+          </w:p>
+        </w:tc>
+        <w:tc>
+          <w:tcPr/>
+          <w:p>
+            <w:pPr>
+              <w:pStyle w:val="Compact"/>
+            </w:pPr>
+            <w:r>
+              <w:t xml:space="preserve">0</w:t>
+            </w:r>
+          </w:p>
+        </w:tc>
+      </w:tr>
+      <w:tr>
+        <w:tc>
+          <w:tcPr/>
+          <w:p>
+            <w:pPr>
+              <w:pStyle w:val="Compact"/>
+            </w:pPr>
+            <w:r>
+              <w:t xml:space="preserve">Pearson, fixed grid</w:t>
+            </w:r>
+          </w:p>
+        </w:tc>
+        <w:tc>
+          <w:tcPr/>
+          <w:p>
+            <w:pPr>
+              <w:pStyle w:val="Compact"/>
+            </w:pPr>
+            <w:r>
+              <w:t xml:space="preserve">any same-form</w:t>
+            </w:r>
+          </w:p>
+        </w:tc>
+        <w:tc>
+          <w:tcPr/>
+          <w:p>
+            <w:pPr>
+              <w:pStyle w:val="Compact"/>
+            </w:pPr>
+            <w:r>
+              <w:t xml:space="preserve">0.83</w:t>
+            </w:r>
+          </w:p>
+        </w:tc>
+        <w:tc>
+          <w:tcPr/>
+          <w:p>
+            <w:pPr>
+              <w:pStyle w:val="Compact"/>
+            </w:pPr>
+            <w:r>
+              <w:t xml:space="preserve">0.83 [0.77, 0.89]</w:t>
+            </w:r>
+          </w:p>
+        </w:tc>
+        <w:tc>
+          <w:tcPr/>
+          <w:p>
+            <w:pPr>
+              <w:pStyle w:val="Compact"/>
+            </w:pPr>
+            <w:r>
+              <w:t xml:space="preserve">0.00 [0.00, 0.00]</w:t>
+            </w:r>
+          </w:p>
+        </w:tc>
+        <w:tc>
+          <w:tcPr/>
+          <w:p>
+            <w:pPr>
+              <w:pStyle w:val="Compact"/>
+            </w:pPr>
+            <w:r>
+              <w:t xml:space="preserve">1</w:t>
+            </w:r>
+          </w:p>
+        </w:tc>
+      </w:tr>
+      <w:tr>
+        <w:tc>
+          <w:tcPr/>
+          <w:p>
+            <w:pPr>
+              <w:pStyle w:val="Compact"/>
+            </w:pPr>
+            <w:r>
+              <w:t xml:space="preserve">Pearson, fixed grid</w:t>
+            </w:r>
+          </w:p>
+        </w:tc>
+        <w:tc>
+          <w:tcPr/>
+          <w:p>
+            <w:pPr>
+              <w:pStyle w:val="Compact"/>
+            </w:pPr>
+            <w:r>
+              <w:t xml:space="preserve">single-crystal</w:t>
+            </w:r>
+          </w:p>
+        </w:tc>
+        <w:tc>
+          <w:tcPr/>
+          <w:p>
+            <w:pPr>
+              <w:pStyle w:val="Compact"/>
+            </w:pPr>
+            <w:r>
+              <w:t xml:space="preserve">0.30</w:t>
+            </w:r>
+          </w:p>
+        </w:tc>
+        <w:tc>
+          <w:tcPr/>
+          <w:p>
+            <w:pPr>
+              <w:pStyle w:val="Compact"/>
+            </w:pPr>
+            <w:r>
+              <w:t xml:space="preserve">0.30 [0.15, 0.48]</w:t>
+            </w:r>
+          </w:p>
+        </w:tc>
+        <w:tc>
+          <w:tcPr/>
+          <w:p>
+            <w:pPr>
+              <w:pStyle w:val="Compact"/>
+            </w:pPr>
+            <w:r>
+              <w:t xml:space="preserve">0.00 [0.00, 0.00]</w:t>
+            </w:r>
+          </w:p>
+        </w:tc>
+        <w:tc>
+          <w:tcPr/>
+          <w:p>
+            <w:pPr>
+              <w:pStyle w:val="Compact"/>
+            </w:pPr>
+            <w:r>
+              <w:t xml:space="preserve">0</w:t>
+            </w:r>
+          </w:p>
+        </w:tc>
+      </w:tr>
+      <w:tr>
+        <w:tc>
+          <w:tcPr/>
+          <w:p>
+            <w:pPr>
+              <w:pStyle w:val="Compact"/>
+            </w:pPr>
+            <w:r>
+              <w:t xml:space="preserve">WCC, l = 1° + zero scan</w:t>
+            </w:r>
+          </w:p>
+        </w:tc>
+        <w:tc>
+          <w:tcPr/>
+          <w:p>
+            <w:pPr>
+              <w:pStyle w:val="Compact"/>
+            </w:pPr>
+            <w:r>
+              <w:t xml:space="preserve">any same-form</w:t>
+            </w:r>
+          </w:p>
+        </w:tc>
+        <w:tc>
+          <w:tcPr/>
+          <w:p>
+            <w:pPr>
+              <w:pStyle w:val="Compact"/>
+            </w:pPr>
+            <w:r>
+              <w:t xml:space="preserve">0.83</w:t>
+            </w:r>
+          </w:p>
+        </w:tc>
+        <w:tc>
+          <w:tcPr/>
+          <w:p>
+            <w:pPr>
+              <w:pStyle w:val="Compact"/>
+            </w:pPr>
+            <w:r>
+              <w:t xml:space="preserve">0.84 [0.77, 0.90]</w:t>
+            </w:r>
+          </w:p>
+        </w:tc>
+        <w:tc>
+          <w:tcPr/>
+          <w:p>
+            <w:pPr>
+              <w:pStyle w:val="Compact"/>
+            </w:pPr>
+            <w:r>
+              <w:t xml:space="preserve">+0.01 [0.00, +0.02]</w:t>
+            </w:r>
+          </w:p>
+        </w:tc>
+        <w:tc>
+          <w:tcPr/>
+          <w:p>
+            <w:pPr>
+              <w:pStyle w:val="Compact"/>
+            </w:pPr>
+            <w:r>
+              <w:t xml:space="preserve">1</w:t>
+            </w:r>
+          </w:p>
+        </w:tc>
+      </w:tr>
+      <w:tr>
+        <w:tc>
+          <w:tcPr/>
+          <w:p>
+            <w:pPr>
+              <w:pStyle w:val="Compact"/>
+            </w:pPr>
+            <w:r>
+              <w:t xml:space="preserve">WCC, l = 1° + zero scan</w:t>
+            </w:r>
+          </w:p>
+        </w:tc>
+        <w:tc>
+          <w:tcPr/>
+          <w:p>
+            <w:pPr>
+              <w:pStyle w:val="Compact"/>
+            </w:pPr>
+            <w:r>
+              <w:t xml:space="preserve">single-crystal</w:t>
+            </w:r>
+          </w:p>
+        </w:tc>
+        <w:tc>
+          <w:tcPr/>
+          <w:p>
+            <w:pPr>
+              <w:pStyle w:val="Compact"/>
+            </w:pPr>
+            <w:r>
+              <w:t xml:space="preserve">0.50</w:t>
+            </w:r>
+          </w:p>
+        </w:tc>
+        <w:tc>
+          <w:tcPr/>
+          <w:p>
+            <w:pPr>
+              <w:pStyle w:val="Compact"/>
+            </w:pPr>
+            <w:r>
+              <w:t xml:space="preserve">0.50 [0.32, 0.67]</w:t>
+            </w:r>
+          </w:p>
+        </w:tc>
+        <w:tc>
+          <w:tcPr/>
+          <w:p>
+            <w:pPr>
+              <w:pStyle w:val="Compact"/>
+            </w:pPr>
+            <w:r>
+              <w:t xml:space="preserve">0.00 [0.00, 0.00]</w:t>
+            </w:r>
+          </w:p>
+        </w:tc>
+        <w:tc>
+          <w:tcPr/>
+          <w:p>
+            <w:pPr>
+              <w:pStyle w:val="Compact"/>
+            </w:pPr>
+            <w:r>
+              <w:t xml:space="preserve">0</w:t>
+            </w:r>
+          </w:p>
+        </w:tc>
+      </w:tr>
+      <w:tr>
+        <w:tc>
+          <w:tcPr/>
+          <w:p>
+            <w:pPr>
+              <w:pStyle w:val="Compact"/>
+            </w:pPr>
+            <w:r>
+              <w:t xml:space="preserve">WCC, l = 2° + zero scan</w:t>
+            </w:r>
+          </w:p>
+        </w:tc>
+        <w:tc>
+          <w:tcPr/>
+          <w:p>
+            <w:pPr>
+              <w:pStyle w:val="Compact"/>
+            </w:pPr>
+            <w:r>
+              <w:t xml:space="preserve">any same-form</w:t>
+            </w:r>
+          </w:p>
+        </w:tc>
+        <w:tc>
+          <w:tcPr/>
+          <w:p>
+            <w:pPr>
+              <w:pStyle w:val="Compact"/>
+            </w:pPr>
+            <w:r>
+              <w:t xml:space="preserve">0.71</w:t>
+            </w:r>
+          </w:p>
+        </w:tc>
+        <w:tc>
+          <w:tcPr/>
+          <w:p>
+            <w:pPr>
+              <w:pStyle w:val="Compact"/>
+            </w:pPr>
+            <w:r>
+              <w:t xml:space="preserve">0.71 [0.64, 0.79]</w:t>
+            </w:r>
+          </w:p>
+        </w:tc>
+        <w:tc>
+          <w:tcPr/>
+          <w:p>
+            <w:pPr>
+              <w:pStyle w:val="Compact"/>
+            </w:pPr>
+            <w:r>
+              <w:t xml:space="preserve">+0.01 [0.00, +0.02]</w:t>
+            </w:r>
+          </w:p>
+        </w:tc>
+        <w:tc>
+          <w:tcPr/>
+          <w:p>
+            <w:pPr>
+              <w:pStyle w:val="Compact"/>
+            </w:pPr>
+            <w:r>
+              <w:t xml:space="preserve">1</w:t>
+            </w:r>
+          </w:p>
+        </w:tc>
+      </w:tr>
+      <w:tr>
+        <w:tc>
+          <w:tcPr/>
+          <w:p>
+            <w:pPr>
+              <w:pStyle w:val="Compact"/>
+            </w:pPr>
+            <w:r>
+              <w:t xml:space="preserve">WCC, l = 2° + zero scan</w:t>
+            </w:r>
+          </w:p>
+        </w:tc>
+        <w:tc>
+          <w:tcPr/>
+          <w:p>
+            <w:pPr>
+              <w:pStyle w:val="Compact"/>
+            </w:pPr>
+            <w:r>
+              <w:t xml:space="preserve">single-crystal</w:t>
+            </w:r>
+          </w:p>
+        </w:tc>
+        <w:tc>
+          <w:tcPr/>
+          <w:p>
+            <w:pPr>
+              <w:pStyle w:val="Compact"/>
+            </w:pPr>
+            <w:r>
+              <w:t xml:space="preserve">0.47</w:t>
+            </w:r>
+          </w:p>
+        </w:tc>
+        <w:tc>
+          <w:tcPr/>
+          <w:p>
+            <w:pPr>
+              <w:pStyle w:val="Compact"/>
+            </w:pPr>
+            <w:r>
+              <w:t xml:space="preserve">0.50 [0.33, 0.67]</w:t>
+            </w:r>
+          </w:p>
+        </w:tc>
+        <w:tc>
+          <w:tcPr/>
+          <w:p>
+            <w:pPr>
+              <w:pStyle w:val="Compact"/>
+            </w:pPr>
+            <w:r>
+              <w:t xml:space="preserve">+0.03 [0.00, +0.10]</w:t>
+            </w:r>
+          </w:p>
+        </w:tc>
+        <w:tc>
+          <w:tcPr/>
+          <w:p>
+            <w:pPr>
+              <w:pStyle w:val="Compact"/>
+            </w:pPr>
+            <w:r>
+              <w:t xml:space="preserve">1</w:t>
+            </w:r>
+          </w:p>
+        </w:tc>
+      </w:tr>
+      <w:tr>
+        <w:tc>
+          <w:tcPr/>
+          <w:p>
+            <w:pPr>
+              <w:pStyle w:val="Compact"/>
+            </w:pPr>
+            <w:r>
+              <w:t xml:space="preserve">Learned embedding</w:t>
+            </w:r>
+          </w:p>
+        </w:tc>
+        <w:tc>
+          <w:tcPr/>
+          <w:p>
+            <w:pPr>
+              <w:pStyle w:val="Compact"/>
+            </w:pPr>
+            <w:r>
+              <w:t xml:space="preserve">any same-form</w:t>
+            </w:r>
+          </w:p>
+        </w:tc>
+        <w:tc>
+          <w:tcPr/>
+          <w:p>
+            <w:pPr>
+              <w:pStyle w:val="Compact"/>
+            </w:pPr>
+            <w:r>
+              <w:t xml:space="preserve">0.02</w:t>
+            </w:r>
+          </w:p>
+        </w:tc>
+        <w:tc>
+          <w:tcPr/>
+          <w:p>
+            <w:pPr>
+              <w:pStyle w:val="Compact"/>
+            </w:pPr>
+            <w:r>
+              <w:t xml:space="preserve">0.01 [0.00, 0.03]</w:t>
+            </w:r>
+          </w:p>
+        </w:tc>
+        <w:tc>
+          <w:tcPr/>
+          <w:p>
+            <w:pPr>
+              <w:pStyle w:val="Compact"/>
+            </w:pPr>
+            <w:r>
+              <w:t xml:space="preserve">0.00 [−0.02, +0.01]</w:t>
+            </w:r>
+          </w:p>
+        </w:tc>
+        <w:tc>
+          <w:tcPr/>
+          <w:p>
+            <w:pPr>
+              <w:pStyle w:val="Compact"/>
+            </w:pPr>
+            <w:r>
+              <w:t xml:space="preserve">2</w:t>
+            </w:r>
+          </w:p>
+        </w:tc>
+      </w:tr>
+      <w:tr>
+        <w:tc>
+          <w:tcPr/>
+          <w:p>
+            <w:pPr>
+              <w:pStyle w:val="Compact"/>
+            </w:pPr>
+            <w:r>
+              <w:t xml:space="preserve">Learned embedding</w:t>
+            </w:r>
+          </w:p>
+        </w:tc>
+        <w:tc>
+          <w:tcPr/>
+          <w:p>
+            <w:pPr>
+              <w:pStyle w:val="Compact"/>
+            </w:pPr>
+            <w:r>
+              <w:t xml:space="preserve">single-crystal</w:t>
+            </w:r>
+          </w:p>
+        </w:tc>
+        <w:tc>
+          <w:tcPr/>
+          <w:p>
+            <w:pPr>
+              <w:pStyle w:val="Compact"/>
+            </w:pPr>
+            <w:r>
+              <w:t xml:space="preserve">0.00</w:t>
+            </w:r>
+          </w:p>
+        </w:tc>
+        <w:tc>
+          <w:tcPr/>
+          <w:p>
+            <w:pPr>
+              <w:pStyle w:val="Compact"/>
+            </w:pPr>
+            <w:r>
+              <w:t xml:space="preserve">0.00 [0.00, 0.00]</w:t>
+            </w:r>
+          </w:p>
+        </w:tc>
+        <w:tc>
+          <w:tcPr/>
+          <w:p>
+            <w:pPr>
+              <w:pStyle w:val="Compact"/>
+            </w:pPr>
+            <w:r>
+              <w:t xml:space="preserve">0.00 [0.00, 0.00]</w:t>
+            </w:r>
+          </w:p>
+        </w:tc>
+        <w:tc>
+          <w:tcPr/>
+          <w:p>
+            <w:pPr>
+              <w:pStyle w:val="Compact"/>
+            </w:pPr>
+            <w:r>
+              <w:t xml:space="preserve">0</w:t>
+            </w:r>
+          </w:p>
+        </w:tc>
+      </w:tr>
+    </w:tbl>
+    <w:bookmarkEnd w:id="22"/>
+    <w:bookmarkStart w:id="23" w:name="s13-the-open-replica-cod"/>
     <w:p>
       <w:pPr>
         <w:pStyle w:val="Heading2"/>
@@ -27046,8 +29440,8 @@
         </w:tc>
       </w:tr>
     </w:tbl>
-    <w:bookmarkEnd w:id="22"/>
     <w:bookmarkEnd w:id="23"/>
+    <w:bookmarkEnd w:id="24"/>
     <w:sectPr>
       <w:footnotePr>
         <w:numRestart w:val="eachSect"/>

</xml_diff>

<commit_message>
C10 Kaduk external set done: classical 0.94-1.00 vs model 0.11 (any same-form), 0.33-0.67 vs 0.00 on 3 single-crystal compounds; ESI S14 + Section 4.7 paragraph, verify 199/199
</commit_message>
<xml_diff>
--- a/paper/dd/esi.docx
+++ b/paper/dd/esi.docx
@@ -2,7 +2,7 @@
 <file path=word/document.xml><?xml version="1.0" encoding="utf-8"?>
 <w:document xmlns:w="http://schemas.openxmlformats.org/wordprocessingml/2006/main" xmlns:m="http://schemas.openxmlformats.org/officeDocument/2006/math" xmlns:r="http://schemas.openxmlformats.org/officeDocument/2006/relationships" xmlns:o="urn:schemas-microsoft-com:office:office" xmlns:v="urn:schemas-microsoft-com:vml" xmlns:w10="urn:schemas-microsoft-com:office:word" xmlns:a="http://schemas.openxmlformats.org/drawingml/2006/main" xmlns:pic="http://schemas.openxmlformats.org/drawingml/2006/picture" xmlns:wp="http://schemas.openxmlformats.org/drawingml/2006/wordprocessingDrawing">
   <w:body>
-    <w:bookmarkStart w:id="24" w:name="electronic-supplementary-information"/>
+    <w:bookmarkStart w:id="25" w:name="electronic-supplementary-information"/>
     <w:p>
       <w:pPr>
         <w:pStyle w:val="Heading1"/>
@@ -29441,7 +29441,3388 @@
       </w:tr>
     </w:tbl>
     <w:bookmarkEnd w:id="23"/>
+    <w:bookmarkStart w:id="24" w:name="X8b3a6840f1ff18b0874d5f1e47e000f953a3050"/>
+    <w:p>
+      <w:pPr>
+        <w:pStyle w:val="Heading2"/>
+      </w:pPr>
+      <w:r>
+        <w:t xml:space="preserve">S14 An external set: raw profiles deposited by Kaduk and co-workers</w:t>
+      </w:r>
+    </w:p>
+    <w:p>
+      <w:pPr>
+        <w:pStyle w:val="FirstParagraph"/>
+      </w:pPr>
+      <w:r>
+        <w:t xml:space="preserve">Queries: the measured profiles in the supplementary CIFs of Kaduk and co-workers’ Powder Diffraction structure reports (public Cambridge Core supplements; donepezil hydrochloride form III from the ICDD deposit): 19 patterns of 18 compounds, 16 synchrotron (15 at 11-BM, λ ≈ 0.414 Å; one at 0.6888 Å) and 3 lab Cu Kα1. None was used in training, tuning or any earlier analysis. The design, predictions and a decision rule were fixed before scoring; preprocessing, scores, checkpoint and library are those of the main benchmark (corrected ln q, no hubness correction). Correct answers follow Section S1, with the article’s refcode as the anchor.</w:t>
+      </w:r>
+    </w:p>
+    <w:p>
+      <w:pPr>
+        <w:pStyle w:val="BodyText"/>
+      </w:pPr>
+      <w:r>
+        <w:t xml:space="preserve">Every anchor is the powder-study entry refined against the query pattern itself, so the any-same-form answer set is an upper bound, not a test. With powder-study entries ignored, only 3 compounds keep an independent single-crystal entry in the library; 8 same-form single-crystal entries lie outside the corpus and were not added, so that the library is identical to the main benchmark.</w:t>
+      </w:r>
+    </w:p>
+    <w:p>
+      <w:pPr>
+        <w:pStyle w:val="BodyText"/>
+      </w:pPr>
+      <w:r>
+        <w:rPr>
+          <w:b/>
+          <w:bCs/>
+        </w:rPr>
+        <w:t xml:space="preserve">Table S23</w:t>
+      </w:r>
+      <w:r>
+        <w:t xml:space="preserve"> </w:t>
+      </w:r>
+      <w:r>
+        <w:t xml:space="preserve">Retrieval on the external set (background-subtracted queries).</w:t>
+      </w:r>
+    </w:p>
+    <w:tbl>
+      <w:tblPr>
+        <w:tblStyle w:val="Table"/>
+        <w:tblW w:type="pct" w:w="5000"/>
+        <w:tblLayout w:type="fixed"/>
+        <w:tblLook w:firstRow="1" w:lastRow="0" w:firstColumn="0" w:lastColumn="0" w:noHBand="0" w:noVBand="0" w:val="0020"/>
+      </w:tblPr>
+      <w:tblGrid>
+        <w:gridCol w:w="1131"/>
+        <w:gridCol w:w="1131"/>
+        <w:gridCol w:w="1131"/>
+        <w:gridCol w:w="1131"/>
+        <w:gridCol w:w="1131"/>
+        <w:gridCol w:w="1131"/>
+        <w:gridCol w:w="1131"/>
+      </w:tblGrid>
+      <w:tr>
+        <w:trPr>
+          <w:tblHeader w:val="on"/>
+        </w:trPr>
+        <w:tc>
+          <w:tcPr/>
+          <w:p>
+            <w:pPr>
+              <w:pStyle w:val="Compact"/>
+            </w:pPr>
+            <w:r>
+              <w:t xml:space="preserve">score</w:t>
+            </w:r>
+          </w:p>
+        </w:tc>
+        <w:tc>
+          <w:tcPr/>
+          <w:p>
+            <w:pPr>
+              <w:pStyle w:val="Compact"/>
+            </w:pPr>
+            <w:r>
+              <w:t xml:space="preserve">answer set</w:t>
+            </w:r>
+          </w:p>
+        </w:tc>
+        <w:tc>
+          <w:tcPr/>
+          <w:p>
+            <w:pPr>
+              <w:pStyle w:val="Compact"/>
+            </w:pPr>
+            <w:r>
+              <w:t xml:space="preserve">patterns / compounds</w:t>
+            </w:r>
+          </w:p>
+        </w:tc>
+        <w:tc>
+          <w:tcPr/>
+          <w:p>
+            <w:pPr>
+              <w:pStyle w:val="Compact"/>
+            </w:pPr>
+            <w:r>
+              <w:t xml:space="preserve">macro top-1</w:t>
+            </w:r>
+          </w:p>
+        </w:tc>
+        <w:tc>
+          <w:tcPr/>
+          <w:p>
+            <w:pPr>
+              <w:pStyle w:val="Compact"/>
+            </w:pPr>
+            <w:r>
+              <w:t xml:space="preserve">macro top-10</w:t>
+            </w:r>
+          </w:p>
+        </w:tc>
+        <w:tc>
+          <w:tcPr/>
+          <w:p>
+            <w:pPr>
+              <w:pStyle w:val="Compact"/>
+            </w:pPr>
+            <w:r>
+              <w:t xml:space="preserve">per-pattern top-1</w:t>
+            </w:r>
+          </w:p>
+        </w:tc>
+        <w:tc>
+          <w:tcPr/>
+          <w:p>
+            <w:pPr>
+              <w:pStyle w:val="Compact"/>
+            </w:pPr>
+            <w:r>
+              <w:t xml:space="preserve">median rank</w:t>
+            </w:r>
+          </w:p>
+        </w:tc>
+      </w:tr>
+      <w:tr>
+        <w:tc>
+          <w:tcPr/>
+          <w:p>
+            <w:pPr>
+              <w:pStyle w:val="Compact"/>
+            </w:pPr>
+            <w:r>
+              <w:t xml:space="preserve">ln q lag + zero scan</w:t>
+            </w:r>
+          </w:p>
+        </w:tc>
+        <w:tc>
+          <w:tcPr/>
+          <w:p>
+            <w:pPr>
+              <w:pStyle w:val="Compact"/>
+            </w:pPr>
+            <w:r>
+              <w:t xml:space="preserve">any same-form</w:t>
+            </w:r>
+          </w:p>
+        </w:tc>
+        <w:tc>
+          <w:tcPr/>
+          <w:p>
+            <w:pPr>
+              <w:pStyle w:val="Compact"/>
+            </w:pPr>
+            <w:r>
+              <w:t xml:space="preserve">19 / 18</w:t>
+            </w:r>
+          </w:p>
+        </w:tc>
+        <w:tc>
+          <w:tcPr/>
+          <w:p>
+            <w:pPr>
+              <w:pStyle w:val="Compact"/>
+            </w:pPr>
+            <w:r>
+              <w:t xml:space="preserve">0.94 [0.83, 1.00]</w:t>
+            </w:r>
+          </w:p>
+        </w:tc>
+        <w:tc>
+          <w:tcPr/>
+          <w:p>
+            <w:pPr>
+              <w:pStyle w:val="Compact"/>
+            </w:pPr>
+            <w:r>
+              <w:t xml:space="preserve">1.00</w:t>
+            </w:r>
+          </w:p>
+        </w:tc>
+        <w:tc>
+          <w:tcPr/>
+          <w:p>
+            <w:pPr>
+              <w:pStyle w:val="Compact"/>
+            </w:pPr>
+            <w:r>
+              <w:t xml:space="preserve">0.95</w:t>
+            </w:r>
+          </w:p>
+        </w:tc>
+        <w:tc>
+          <w:tcPr/>
+          <w:p>
+            <w:pPr>
+              <w:pStyle w:val="Compact"/>
+            </w:pPr>
+            <w:r>
+              <w:t xml:space="preserve">1</w:t>
+            </w:r>
+          </w:p>
+        </w:tc>
+      </w:tr>
+      <w:tr>
+        <w:tc>
+          <w:tcPr/>
+          <w:p>
+            <w:pPr>
+              <w:pStyle w:val="Compact"/>
+            </w:pPr>
+            <w:r>
+              <w:t xml:space="preserve">ln q lag + zero scan</w:t>
+            </w:r>
+          </w:p>
+        </w:tc>
+        <w:tc>
+          <w:tcPr/>
+          <w:p>
+            <w:pPr>
+              <w:pStyle w:val="Compact"/>
+            </w:pPr>
+            <w:r>
+              <w:t xml:space="preserve">single-crystal</w:t>
+            </w:r>
+          </w:p>
+        </w:tc>
+        <w:tc>
+          <w:tcPr/>
+          <w:p>
+            <w:pPr>
+              <w:pStyle w:val="Compact"/>
+            </w:pPr>
+            <w:r>
+              <w:t xml:space="preserve">3 / 3</w:t>
+            </w:r>
+          </w:p>
+        </w:tc>
+        <w:tc>
+          <w:tcPr/>
+          <w:p>
+            <w:pPr>
+              <w:pStyle w:val="Compact"/>
+            </w:pPr>
+            <w:r>
+              <w:t xml:space="preserve">0.67 [0.00, 1.00]</w:t>
+            </w:r>
+          </w:p>
+        </w:tc>
+        <w:tc>
+          <w:tcPr/>
+          <w:p>
+            <w:pPr>
+              <w:pStyle w:val="Compact"/>
+            </w:pPr>
+            <w:r>
+              <w:t xml:space="preserve">1.00</w:t>
+            </w:r>
+          </w:p>
+        </w:tc>
+        <w:tc>
+          <w:tcPr/>
+          <w:p>
+            <w:pPr>
+              <w:pStyle w:val="Compact"/>
+            </w:pPr>
+            <w:r>
+              <w:t xml:space="preserve">0.67</w:t>
+            </w:r>
+          </w:p>
+        </w:tc>
+        <w:tc>
+          <w:tcPr/>
+          <w:p>
+            <w:pPr>
+              <w:pStyle w:val="Compact"/>
+            </w:pPr>
+            <w:r>
+              <w:t xml:space="preserve">1</w:t>
+            </w:r>
+          </w:p>
+        </w:tc>
+      </w:tr>
+      <w:tr>
+        <w:tc>
+          <w:tcPr/>
+          <w:p>
+            <w:pPr>
+              <w:pStyle w:val="Compact"/>
+            </w:pPr>
+            <w:r>
+              <w:t xml:space="preserve">Cosine + zero scan</w:t>
+            </w:r>
+          </w:p>
+        </w:tc>
+        <w:tc>
+          <w:tcPr/>
+          <w:p>
+            <w:pPr>
+              <w:pStyle w:val="Compact"/>
+            </w:pPr>
+            <w:r>
+              <w:t xml:space="preserve">any same-form</w:t>
+            </w:r>
+          </w:p>
+        </w:tc>
+        <w:tc>
+          <w:tcPr/>
+          <w:p>
+            <w:pPr>
+              <w:pStyle w:val="Compact"/>
+            </w:pPr>
+            <w:r>
+              <w:t xml:space="preserve">19 / 18</w:t>
+            </w:r>
+          </w:p>
+        </w:tc>
+        <w:tc>
+          <w:tcPr/>
+          <w:p>
+            <w:pPr>
+              <w:pStyle w:val="Compact"/>
+            </w:pPr>
+            <w:r>
+              <w:t xml:space="preserve">1.00 [1.00, 1.00]</w:t>
+            </w:r>
+          </w:p>
+        </w:tc>
+        <w:tc>
+          <w:tcPr/>
+          <w:p>
+            <w:pPr>
+              <w:pStyle w:val="Compact"/>
+            </w:pPr>
+            <w:r>
+              <w:t xml:space="preserve">1.00</w:t>
+            </w:r>
+          </w:p>
+        </w:tc>
+        <w:tc>
+          <w:tcPr/>
+          <w:p>
+            <w:pPr>
+              <w:pStyle w:val="Compact"/>
+            </w:pPr>
+            <w:r>
+              <w:t xml:space="preserve">1.00</w:t>
+            </w:r>
+          </w:p>
+        </w:tc>
+        <w:tc>
+          <w:tcPr/>
+          <w:p>
+            <w:pPr>
+              <w:pStyle w:val="Compact"/>
+            </w:pPr>
+            <w:r>
+              <w:t xml:space="preserve">1</w:t>
+            </w:r>
+          </w:p>
+        </w:tc>
+      </w:tr>
+      <w:tr>
+        <w:tc>
+          <w:tcPr/>
+          <w:p>
+            <w:pPr>
+              <w:pStyle w:val="Compact"/>
+            </w:pPr>
+            <w:r>
+              <w:t xml:space="preserve">Cosine + zero scan</w:t>
+            </w:r>
+          </w:p>
+        </w:tc>
+        <w:tc>
+          <w:tcPr/>
+          <w:p>
+            <w:pPr>
+              <w:pStyle w:val="Compact"/>
+            </w:pPr>
+            <w:r>
+              <w:t xml:space="preserve">single-crystal</w:t>
+            </w:r>
+          </w:p>
+        </w:tc>
+        <w:tc>
+          <w:tcPr/>
+          <w:p>
+            <w:pPr>
+              <w:pStyle w:val="Compact"/>
+            </w:pPr>
+            <w:r>
+              <w:t xml:space="preserve">3 / 3</w:t>
+            </w:r>
+          </w:p>
+        </w:tc>
+        <w:tc>
+          <w:tcPr/>
+          <w:p>
+            <w:pPr>
+              <w:pStyle w:val="Compact"/>
+            </w:pPr>
+            <w:r>
+              <w:t xml:space="preserve">0.33 [0.00, 1.00]</w:t>
+            </w:r>
+          </w:p>
+        </w:tc>
+        <w:tc>
+          <w:tcPr/>
+          <w:p>
+            <w:pPr>
+              <w:pStyle w:val="Compact"/>
+            </w:pPr>
+            <w:r>
+              <w:t xml:space="preserve">0.67</w:t>
+            </w:r>
+          </w:p>
+        </w:tc>
+        <w:tc>
+          <w:tcPr/>
+          <w:p>
+            <w:pPr>
+              <w:pStyle w:val="Compact"/>
+            </w:pPr>
+            <w:r>
+              <w:t xml:space="preserve">0.33</w:t>
+            </w:r>
+          </w:p>
+        </w:tc>
+        <w:tc>
+          <w:tcPr/>
+          <w:p>
+            <w:pPr>
+              <w:pStyle w:val="Compact"/>
+            </w:pPr>
+            <w:r>
+              <w:t xml:space="preserve">3</w:t>
+            </w:r>
+          </w:p>
+        </w:tc>
+      </w:tr>
+      <w:tr>
+        <w:tc>
+          <w:tcPr/>
+          <w:p>
+            <w:pPr>
+              <w:pStyle w:val="Compact"/>
+            </w:pPr>
+            <w:r>
+              <w:t xml:space="preserve">Pearson, fixed grid</w:t>
+            </w:r>
+          </w:p>
+        </w:tc>
+        <w:tc>
+          <w:tcPr/>
+          <w:p>
+            <w:pPr>
+              <w:pStyle w:val="Compact"/>
+            </w:pPr>
+            <w:r>
+              <w:t xml:space="preserve">any same-form</w:t>
+            </w:r>
+          </w:p>
+        </w:tc>
+        <w:tc>
+          <w:tcPr/>
+          <w:p>
+            <w:pPr>
+              <w:pStyle w:val="Compact"/>
+            </w:pPr>
+            <w:r>
+              <w:t xml:space="preserve">19 / 18</w:t>
+            </w:r>
+          </w:p>
+        </w:tc>
+        <w:tc>
+          <w:tcPr/>
+          <w:p>
+            <w:pPr>
+              <w:pStyle w:val="Compact"/>
+            </w:pPr>
+            <w:r>
+              <w:t xml:space="preserve">1.00 [1.00, 1.00]</w:t>
+            </w:r>
+          </w:p>
+        </w:tc>
+        <w:tc>
+          <w:tcPr/>
+          <w:p>
+            <w:pPr>
+              <w:pStyle w:val="Compact"/>
+            </w:pPr>
+            <w:r>
+              <w:t xml:space="preserve">1.00</w:t>
+            </w:r>
+          </w:p>
+        </w:tc>
+        <w:tc>
+          <w:tcPr/>
+          <w:p>
+            <w:pPr>
+              <w:pStyle w:val="Compact"/>
+            </w:pPr>
+            <w:r>
+              <w:t xml:space="preserve">1.00</w:t>
+            </w:r>
+          </w:p>
+        </w:tc>
+        <w:tc>
+          <w:tcPr/>
+          <w:p>
+            <w:pPr>
+              <w:pStyle w:val="Compact"/>
+            </w:pPr>
+            <w:r>
+              <w:t xml:space="preserve">1</w:t>
+            </w:r>
+          </w:p>
+        </w:tc>
+      </w:tr>
+      <w:tr>
+        <w:tc>
+          <w:tcPr/>
+          <w:p>
+            <w:pPr>
+              <w:pStyle w:val="Compact"/>
+            </w:pPr>
+            <w:r>
+              <w:t xml:space="preserve">Pearson, fixed grid</w:t>
+            </w:r>
+          </w:p>
+        </w:tc>
+        <w:tc>
+          <w:tcPr/>
+          <w:p>
+            <w:pPr>
+              <w:pStyle w:val="Compact"/>
+            </w:pPr>
+            <w:r>
+              <w:t xml:space="preserve">single-crystal</w:t>
+            </w:r>
+          </w:p>
+        </w:tc>
+        <w:tc>
+          <w:tcPr/>
+          <w:p>
+            <w:pPr>
+              <w:pStyle w:val="Compact"/>
+            </w:pPr>
+            <w:r>
+              <w:t xml:space="preserve">3 / 3</w:t>
+            </w:r>
+          </w:p>
+        </w:tc>
+        <w:tc>
+          <w:tcPr/>
+          <w:p>
+            <w:pPr>
+              <w:pStyle w:val="Compact"/>
+            </w:pPr>
+            <w:r>
+              <w:t xml:space="preserve">0.33 [0.00, 1.00]</w:t>
+            </w:r>
+          </w:p>
+        </w:tc>
+        <w:tc>
+          <w:tcPr/>
+          <w:p>
+            <w:pPr>
+              <w:pStyle w:val="Compact"/>
+            </w:pPr>
+            <w:r>
+              <w:t xml:space="preserve">0.67</w:t>
+            </w:r>
+          </w:p>
+        </w:tc>
+        <w:tc>
+          <w:tcPr/>
+          <w:p>
+            <w:pPr>
+              <w:pStyle w:val="Compact"/>
+            </w:pPr>
+            <w:r>
+              <w:t xml:space="preserve">0.33</w:t>
+            </w:r>
+          </w:p>
+        </w:tc>
+        <w:tc>
+          <w:tcPr/>
+          <w:p>
+            <w:pPr>
+              <w:pStyle w:val="Compact"/>
+            </w:pPr>
+            <w:r>
+              <w:t xml:space="preserve">3</w:t>
+            </w:r>
+          </w:p>
+        </w:tc>
+      </w:tr>
+      <w:tr>
+        <w:tc>
+          <w:tcPr/>
+          <w:p>
+            <w:pPr>
+              <w:pStyle w:val="Compact"/>
+            </w:pPr>
+            <w:r>
+              <w:t xml:space="preserve">WCC, l = 1° + zero scan</w:t>
+            </w:r>
+          </w:p>
+        </w:tc>
+        <w:tc>
+          <w:tcPr/>
+          <w:p>
+            <w:pPr>
+              <w:pStyle w:val="Compact"/>
+            </w:pPr>
+            <w:r>
+              <w:t xml:space="preserve">any same-form</w:t>
+            </w:r>
+          </w:p>
+        </w:tc>
+        <w:tc>
+          <w:tcPr/>
+          <w:p>
+            <w:pPr>
+              <w:pStyle w:val="Compact"/>
+            </w:pPr>
+            <w:r>
+              <w:t xml:space="preserve">19 / 18</w:t>
+            </w:r>
+          </w:p>
+        </w:tc>
+        <w:tc>
+          <w:tcPr/>
+          <w:p>
+            <w:pPr>
+              <w:pStyle w:val="Compact"/>
+            </w:pPr>
+            <w:r>
+              <w:t xml:space="preserve">0.94 [0.83, 1.00]</w:t>
+            </w:r>
+          </w:p>
+        </w:tc>
+        <w:tc>
+          <w:tcPr/>
+          <w:p>
+            <w:pPr>
+              <w:pStyle w:val="Compact"/>
+            </w:pPr>
+            <w:r>
+              <w:t xml:space="preserve">1.00</w:t>
+            </w:r>
+          </w:p>
+        </w:tc>
+        <w:tc>
+          <w:tcPr/>
+          <w:p>
+            <w:pPr>
+              <w:pStyle w:val="Compact"/>
+            </w:pPr>
+            <w:r>
+              <w:t xml:space="preserve">0.95</w:t>
+            </w:r>
+          </w:p>
+        </w:tc>
+        <w:tc>
+          <w:tcPr/>
+          <w:p>
+            <w:pPr>
+              <w:pStyle w:val="Compact"/>
+            </w:pPr>
+            <w:r>
+              <w:t xml:space="preserve">1</w:t>
+            </w:r>
+          </w:p>
+        </w:tc>
+      </w:tr>
+      <w:tr>
+        <w:tc>
+          <w:tcPr/>
+          <w:p>
+            <w:pPr>
+              <w:pStyle w:val="Compact"/>
+            </w:pPr>
+            <w:r>
+              <w:t xml:space="preserve">WCC, l = 1° + zero scan</w:t>
+            </w:r>
+          </w:p>
+        </w:tc>
+        <w:tc>
+          <w:tcPr/>
+          <w:p>
+            <w:pPr>
+              <w:pStyle w:val="Compact"/>
+            </w:pPr>
+            <w:r>
+              <w:t xml:space="preserve">single-crystal</w:t>
+            </w:r>
+          </w:p>
+        </w:tc>
+        <w:tc>
+          <w:tcPr/>
+          <w:p>
+            <w:pPr>
+              <w:pStyle w:val="Compact"/>
+            </w:pPr>
+            <w:r>
+              <w:t xml:space="preserve">3 / 3</w:t>
+            </w:r>
+          </w:p>
+        </w:tc>
+        <w:tc>
+          <w:tcPr/>
+          <w:p>
+            <w:pPr>
+              <w:pStyle w:val="Compact"/>
+            </w:pPr>
+            <w:r>
+              <w:t xml:space="preserve">0.67 [0.00, 1.00]</w:t>
+            </w:r>
+          </w:p>
+        </w:tc>
+        <w:tc>
+          <w:tcPr/>
+          <w:p>
+            <w:pPr>
+              <w:pStyle w:val="Compact"/>
+            </w:pPr>
+            <w:r>
+              <w:t xml:space="preserve">1.00</w:t>
+            </w:r>
+          </w:p>
+        </w:tc>
+        <w:tc>
+          <w:tcPr/>
+          <w:p>
+            <w:pPr>
+              <w:pStyle w:val="Compact"/>
+            </w:pPr>
+            <w:r>
+              <w:t xml:space="preserve">0.67</w:t>
+            </w:r>
+          </w:p>
+        </w:tc>
+        <w:tc>
+          <w:tcPr/>
+          <w:p>
+            <w:pPr>
+              <w:pStyle w:val="Compact"/>
+            </w:pPr>
+            <w:r>
+              <w:t xml:space="preserve">1</w:t>
+            </w:r>
+          </w:p>
+        </w:tc>
+      </w:tr>
+      <w:tr>
+        <w:tc>
+          <w:tcPr/>
+          <w:p>
+            <w:pPr>
+              <w:pStyle w:val="Compact"/>
+            </w:pPr>
+            <w:r>
+              <w:t xml:space="preserve">WCC, l = 2° + zero scan</w:t>
+            </w:r>
+          </w:p>
+        </w:tc>
+        <w:tc>
+          <w:tcPr/>
+          <w:p>
+            <w:pPr>
+              <w:pStyle w:val="Compact"/>
+            </w:pPr>
+            <w:r>
+              <w:t xml:space="preserve">any same-form</w:t>
+            </w:r>
+          </w:p>
+        </w:tc>
+        <w:tc>
+          <w:tcPr/>
+          <w:p>
+            <w:pPr>
+              <w:pStyle w:val="Compact"/>
+            </w:pPr>
+            <w:r>
+              <w:t xml:space="preserve">19 / 18</w:t>
+            </w:r>
+          </w:p>
+        </w:tc>
+        <w:tc>
+          <w:tcPr/>
+          <w:p>
+            <w:pPr>
+              <w:pStyle w:val="Compact"/>
+            </w:pPr>
+            <w:r>
+              <w:t xml:space="preserve">1.00 [1.00, 1.00]</w:t>
+            </w:r>
+          </w:p>
+        </w:tc>
+        <w:tc>
+          <w:tcPr/>
+          <w:p>
+            <w:pPr>
+              <w:pStyle w:val="Compact"/>
+            </w:pPr>
+            <w:r>
+              <w:t xml:space="preserve">1.00</w:t>
+            </w:r>
+          </w:p>
+        </w:tc>
+        <w:tc>
+          <w:tcPr/>
+          <w:p>
+            <w:pPr>
+              <w:pStyle w:val="Compact"/>
+            </w:pPr>
+            <w:r>
+              <w:t xml:space="preserve">1.00</w:t>
+            </w:r>
+          </w:p>
+        </w:tc>
+        <w:tc>
+          <w:tcPr/>
+          <w:p>
+            <w:pPr>
+              <w:pStyle w:val="Compact"/>
+            </w:pPr>
+            <w:r>
+              <w:t xml:space="preserve">1</w:t>
+            </w:r>
+          </w:p>
+        </w:tc>
+      </w:tr>
+      <w:tr>
+        <w:tc>
+          <w:tcPr/>
+          <w:p>
+            <w:pPr>
+              <w:pStyle w:val="Compact"/>
+            </w:pPr>
+            <w:r>
+              <w:t xml:space="preserve">WCC, l = 2° + zero scan</w:t>
+            </w:r>
+          </w:p>
+        </w:tc>
+        <w:tc>
+          <w:tcPr/>
+          <w:p>
+            <w:pPr>
+              <w:pStyle w:val="Compact"/>
+            </w:pPr>
+            <w:r>
+              <w:t xml:space="preserve">single-crystal</w:t>
+            </w:r>
+          </w:p>
+        </w:tc>
+        <w:tc>
+          <w:tcPr/>
+          <w:p>
+            <w:pPr>
+              <w:pStyle w:val="Compact"/>
+            </w:pPr>
+            <w:r>
+              <w:t xml:space="preserve">3 / 3</w:t>
+            </w:r>
+          </w:p>
+        </w:tc>
+        <w:tc>
+          <w:tcPr/>
+          <w:p>
+            <w:pPr>
+              <w:pStyle w:val="Compact"/>
+            </w:pPr>
+            <w:r>
+              <w:t xml:space="preserve">0.67 [0.00, 1.00]</w:t>
+            </w:r>
+          </w:p>
+        </w:tc>
+        <w:tc>
+          <w:tcPr/>
+          <w:p>
+            <w:pPr>
+              <w:pStyle w:val="Compact"/>
+            </w:pPr>
+            <w:r>
+              <w:t xml:space="preserve">1.00</w:t>
+            </w:r>
+          </w:p>
+        </w:tc>
+        <w:tc>
+          <w:tcPr/>
+          <w:p>
+            <w:pPr>
+              <w:pStyle w:val="Compact"/>
+            </w:pPr>
+            <w:r>
+              <w:t xml:space="preserve">0.67</w:t>
+            </w:r>
+          </w:p>
+        </w:tc>
+        <w:tc>
+          <w:tcPr/>
+          <w:p>
+            <w:pPr>
+              <w:pStyle w:val="Compact"/>
+            </w:pPr>
+            <w:r>
+              <w:t xml:space="preserve">1</w:t>
+            </w:r>
+          </w:p>
+        </w:tc>
+      </w:tr>
+      <w:tr>
+        <w:tc>
+          <w:tcPr/>
+          <w:p>
+            <w:pPr>
+              <w:pStyle w:val="Compact"/>
+            </w:pPr>
+            <w:r>
+              <w:t xml:space="preserve">Learned embedding</w:t>
+            </w:r>
+          </w:p>
+        </w:tc>
+        <w:tc>
+          <w:tcPr/>
+          <w:p>
+            <w:pPr>
+              <w:pStyle w:val="Compact"/>
+            </w:pPr>
+            <w:r>
+              <w:t xml:space="preserve">any same-form</w:t>
+            </w:r>
+          </w:p>
+        </w:tc>
+        <w:tc>
+          <w:tcPr/>
+          <w:p>
+            <w:pPr>
+              <w:pStyle w:val="Compact"/>
+            </w:pPr>
+            <w:r>
+              <w:t xml:space="preserve">19 / 18</w:t>
+            </w:r>
+          </w:p>
+        </w:tc>
+        <w:tc>
+          <w:tcPr/>
+          <w:p>
+            <w:pPr>
+              <w:pStyle w:val="Compact"/>
+            </w:pPr>
+            <w:r>
+              <w:t xml:space="preserve">0.11 [0.00, 0.28]</w:t>
+            </w:r>
+          </w:p>
+        </w:tc>
+        <w:tc>
+          <w:tcPr/>
+          <w:p>
+            <w:pPr>
+              <w:pStyle w:val="Compact"/>
+            </w:pPr>
+            <w:r>
+              <w:t xml:space="preserve">0.28</w:t>
+            </w:r>
+          </w:p>
+        </w:tc>
+        <w:tc>
+          <w:tcPr/>
+          <w:p>
+            <w:pPr>
+              <w:pStyle w:val="Compact"/>
+            </w:pPr>
+            <w:r>
+              <w:t xml:space="preserve">0.11</w:t>
+            </w:r>
+          </w:p>
+        </w:tc>
+        <w:tc>
+          <w:tcPr/>
+          <w:p>
+            <w:pPr>
+              <w:pStyle w:val="Compact"/>
+            </w:pPr>
+            <w:r>
+              <w:t xml:space="preserve">255</w:t>
+            </w:r>
+          </w:p>
+        </w:tc>
+      </w:tr>
+      <w:tr>
+        <w:tc>
+          <w:tcPr/>
+          <w:p>
+            <w:pPr>
+              <w:pStyle w:val="Compact"/>
+            </w:pPr>
+            <w:r>
+              <w:t xml:space="preserve">Learned embedding</w:t>
+            </w:r>
+          </w:p>
+        </w:tc>
+        <w:tc>
+          <w:tcPr/>
+          <w:p>
+            <w:pPr>
+              <w:pStyle w:val="Compact"/>
+            </w:pPr>
+            <w:r>
+              <w:t xml:space="preserve">single-crystal</w:t>
+            </w:r>
+          </w:p>
+        </w:tc>
+        <w:tc>
+          <w:tcPr/>
+          <w:p>
+            <w:pPr>
+              <w:pStyle w:val="Compact"/>
+            </w:pPr>
+            <w:r>
+              <w:t xml:space="preserve">3 / 3</w:t>
+            </w:r>
+          </w:p>
+        </w:tc>
+        <w:tc>
+          <w:tcPr/>
+          <w:p>
+            <w:pPr>
+              <w:pStyle w:val="Compact"/>
+            </w:pPr>
+            <w:r>
+              <w:t xml:space="preserve">0.00 [0.00, 0.00]</w:t>
+            </w:r>
+          </w:p>
+        </w:tc>
+        <w:tc>
+          <w:tcPr/>
+          <w:p>
+            <w:pPr>
+              <w:pStyle w:val="Compact"/>
+            </w:pPr>
+            <w:r>
+              <w:t xml:space="preserve">0.00</w:t>
+            </w:r>
+          </w:p>
+        </w:tc>
+        <w:tc>
+          <w:tcPr/>
+          <w:p>
+            <w:pPr>
+              <w:pStyle w:val="Compact"/>
+            </w:pPr>
+            <w:r>
+              <w:t xml:space="preserve">0.00</w:t>
+            </w:r>
+          </w:p>
+        </w:tc>
+        <w:tc>
+          <w:tcPr/>
+          <w:p>
+            <w:pPr>
+              <w:pStyle w:val="Compact"/>
+            </w:pPr>
+            <w:r>
+              <w:t xml:space="preserve">95</w:t>
+            </w:r>
+          </w:p>
+        </w:tc>
+      </w:tr>
+    </w:tbl>
+    <w:p>
+      <w:pPr>
+        <w:pStyle w:val="BodyText"/>
+      </w:pPr>
+      <w:r>
+        <w:rPr>
+          <w:b/>
+          <w:bCs/>
+        </w:rPr>
+        <w:t xml:space="preserve">Table S24</w:t>
+      </w:r>
+      <w:r>
+        <w:t xml:space="preserve"> </w:t>
+      </w:r>
+      <w:r>
+        <w:t xml:space="preserve">Rank of the best correct entry per pattern (1 = first place;</w:t>
+      </w:r>
+      <w:r>
+        <w:t xml:space="preserve"> </w:t>
+      </w:r>
+      <w:r>
+        <w:t xml:space="preserve">‘–’</w:t>
+      </w:r>
+      <w:r>
+        <w:t xml:space="preserve">: no correct entry in the library).</w:t>
+      </w:r>
+    </w:p>
+    <w:tbl>
+      <w:tblPr>
+        <w:tblStyle w:val="Table"/>
+        <w:tblW w:type="pct" w:w="5000"/>
+        <w:tblLayout w:type="fixed"/>
+        <w:tblLook w:firstRow="1" w:lastRow="0" w:firstColumn="0" w:lastColumn="0" w:noHBand="0" w:noVBand="0" w:val="0020"/>
+      </w:tblPr>
+      <w:tblGrid>
+        <w:gridCol w:w="792"/>
+        <w:gridCol w:w="792"/>
+        <w:gridCol w:w="792"/>
+        <w:gridCol w:w="792"/>
+        <w:gridCol w:w="792"/>
+        <w:gridCol w:w="792"/>
+        <w:gridCol w:w="792"/>
+        <w:gridCol w:w="792"/>
+        <w:gridCol w:w="792"/>
+        <w:gridCol w:w="792"/>
+      </w:tblGrid>
+      <w:tr>
+        <w:trPr>
+          <w:tblHeader w:val="on"/>
+        </w:trPr>
+        <w:tc>
+          <w:tcPr/>
+          <w:p>
+            <w:pPr>
+              <w:pStyle w:val="Compact"/>
+            </w:pPr>
+            <w:r>
+              <w:t xml:space="preserve">compound</w:t>
+            </w:r>
+          </w:p>
+        </w:tc>
+        <w:tc>
+          <w:tcPr/>
+          <w:p>
+            <w:pPr>
+              <w:pStyle w:val="Compact"/>
+            </w:pPr>
+            <w:r>
+              <w:t xml:space="preserve">anchor</w:t>
+            </w:r>
+          </w:p>
+        </w:tc>
+        <w:tc>
+          <w:tcPr/>
+          <w:p>
+            <w:pPr>
+              <w:pStyle w:val="Compact"/>
+            </w:pPr>
+            <w:r>
+              <w:t xml:space="preserve">article DOI</w:t>
+            </w:r>
+          </w:p>
+        </w:tc>
+        <w:tc>
+          <w:tcPr/>
+          <w:p>
+            <w:pPr>
+              <w:pStyle w:val="Compact"/>
+            </w:pPr>
+            <w:r>
+              <w:t xml:space="preserve">source</w:t>
+            </w:r>
+          </w:p>
+        </w:tc>
+        <w:tc>
+          <w:tcPr/>
+          <w:p>
+            <w:pPr>
+              <w:pStyle w:val="Compact"/>
+            </w:pPr>
+            <w:r>
+              <w:t xml:space="preserve">Cu-grid coverage</w:t>
+            </w:r>
+          </w:p>
+        </w:tc>
+        <w:tc>
+          <w:tcPr/>
+          <w:p>
+            <w:pPr>
+              <w:pStyle w:val="Compact"/>
+            </w:pPr>
+            <w:r>
+              <w:t xml:space="preserve">ln q, any</w:t>
+            </w:r>
+          </w:p>
+        </w:tc>
+        <w:tc>
+          <w:tcPr/>
+          <w:p>
+            <w:pPr>
+              <w:pStyle w:val="Compact"/>
+            </w:pPr>
+            <w:r>
+              <w:t xml:space="preserve">Pearson, any</w:t>
+            </w:r>
+          </w:p>
+        </w:tc>
+        <w:tc>
+          <w:tcPr/>
+          <w:p>
+            <w:pPr>
+              <w:pStyle w:val="Compact"/>
+            </w:pPr>
+            <w:r>
+              <w:t xml:space="preserve">model, any</w:t>
+            </w:r>
+          </w:p>
+        </w:tc>
+        <w:tc>
+          <w:tcPr/>
+          <w:p>
+            <w:pPr>
+              <w:pStyle w:val="Compact"/>
+            </w:pPr>
+            <w:r>
+              <w:t xml:space="preserve">ln q, single-crystal</w:t>
+            </w:r>
+          </w:p>
+        </w:tc>
+        <w:tc>
+          <w:tcPr/>
+          <w:p>
+            <w:pPr>
+              <w:pStyle w:val="Compact"/>
+            </w:pPr>
+            <w:r>
+              <w:t xml:space="preserve">model, single-crystal</w:t>
+            </w:r>
+          </w:p>
+        </w:tc>
+      </w:tr>
+      <w:tr>
+        <w:tc>
+          <w:tcPr/>
+          <w:p>
+            <w:pPr>
+              <w:pStyle w:val="Compact"/>
+            </w:pPr>
+            <w:r>
+              <w:t xml:space="preserve">tramadol hydrochloride</w:t>
+            </w:r>
+          </w:p>
+        </w:tc>
+        <w:tc>
+          <w:tcPr/>
+          <w:p>
+            <w:pPr>
+              <w:pStyle w:val="Compact"/>
+            </w:pPr>
+            <w:r>
+              <w:t xml:space="preserve">BUFPAV01</w:t>
+            </w:r>
+          </w:p>
+        </w:tc>
+        <w:tc>
+          <w:tcPr/>
+          <w:p>
+            <w:pPr>
+              <w:pStyle w:val="Compact"/>
+            </w:pPr>
+            <w:r>
+              <w:t xml:space="preserve">10.1017/s088571561500041x</w:t>
+            </w:r>
+          </w:p>
+        </w:tc>
+        <w:tc>
+          <w:tcPr/>
+          <w:p>
+            <w:pPr>
+              <w:pStyle w:val="Compact"/>
+            </w:pPr>
+            <w:r>
+              <w:t xml:space="preserve">synchrotron, 0.4137 Å</w:t>
+            </w:r>
+          </w:p>
+        </w:tc>
+        <w:tc>
+          <w:tcPr/>
+          <w:p>
+            <w:pPr>
+              <w:pStyle w:val="Compact"/>
+            </w:pPr>
+            <w:r>
+              <w:t xml:space="preserve">1.00</w:t>
+            </w:r>
+          </w:p>
+        </w:tc>
+        <w:tc>
+          <w:tcPr/>
+          <w:p>
+            <w:pPr>
+              <w:pStyle w:val="Compact"/>
+            </w:pPr>
+            <w:r>
+              <w:t xml:space="preserve">1</w:t>
+            </w:r>
+          </w:p>
+        </w:tc>
+        <w:tc>
+          <w:tcPr/>
+          <w:p>
+            <w:pPr>
+              <w:pStyle w:val="Compact"/>
+            </w:pPr>
+            <w:r>
+              <w:t xml:space="preserve">1</w:t>
+            </w:r>
+          </w:p>
+        </w:tc>
+        <w:tc>
+          <w:tcPr/>
+          <w:p>
+            <w:pPr>
+              <w:pStyle w:val="Compact"/>
+            </w:pPr>
+            <w:r>
+              <w:t xml:space="preserve">523</w:t>
+            </w:r>
+          </w:p>
+        </w:tc>
+        <w:tc>
+          <w:tcPr/>
+          <w:p>
+            <w:pPr>
+              <w:pStyle w:val="Compact"/>
+            </w:pPr>
+            <w:r>
+              <w:t xml:space="preserve">1</w:t>
+            </w:r>
+          </w:p>
+        </w:tc>
+        <w:tc>
+          <w:tcPr/>
+          <w:p>
+            <w:pPr>
+              <w:pStyle w:val="Compact"/>
+            </w:pPr>
+            <w:r>
+              <w:t xml:space="preserve">523</w:t>
+            </w:r>
+          </w:p>
+        </w:tc>
+      </w:tr>
+      <w:tr>
+        <w:tc>
+          <w:tcPr/>
+          <w:p>
+            <w:pPr>
+              <w:pStyle w:val="Compact"/>
+            </w:pPr>
+            <w:r>
+              <w:t xml:space="preserve">folic acid dihydrate</w:t>
+            </w:r>
+          </w:p>
+        </w:tc>
+        <w:tc>
+          <w:tcPr/>
+          <w:p>
+            <w:pPr>
+              <w:pStyle w:val="Compact"/>
+            </w:pPr>
+            <w:r>
+              <w:t xml:space="preserve">FOLCAH03</w:t>
+            </w:r>
+          </w:p>
+        </w:tc>
+        <w:tc>
+          <w:tcPr/>
+          <w:p>
+            <w:pPr>
+              <w:pStyle w:val="Compact"/>
+            </w:pPr>
+            <w:r>
+              <w:t xml:space="preserve">10.1017/s0885715614000815</w:t>
+            </w:r>
+          </w:p>
+        </w:tc>
+        <w:tc>
+          <w:tcPr/>
+          <w:p>
+            <w:pPr>
+              <w:pStyle w:val="Compact"/>
+            </w:pPr>
+            <w:r>
+              <w:t xml:space="preserve">synchrotron, 0.4137 Å</w:t>
+            </w:r>
+          </w:p>
+        </w:tc>
+        <w:tc>
+          <w:tcPr/>
+          <w:p>
+            <w:pPr>
+              <w:pStyle w:val="Compact"/>
+            </w:pPr>
+            <w:r>
+              <w:t xml:space="preserve">1.00</w:t>
+            </w:r>
+          </w:p>
+        </w:tc>
+        <w:tc>
+          <w:tcPr/>
+          <w:p>
+            <w:pPr>
+              <w:pStyle w:val="Compact"/>
+            </w:pPr>
+            <w:r>
+              <w:t xml:space="preserve">1</w:t>
+            </w:r>
+          </w:p>
+        </w:tc>
+        <w:tc>
+          <w:tcPr/>
+          <w:p>
+            <w:pPr>
+              <w:pStyle w:val="Compact"/>
+            </w:pPr>
+            <w:r>
+              <w:t xml:space="preserve">1</w:t>
+            </w:r>
+          </w:p>
+        </w:tc>
+        <w:tc>
+          <w:tcPr/>
+          <w:p>
+            <w:pPr>
+              <w:pStyle w:val="Compact"/>
+            </w:pPr>
+            <w:r>
+              <w:t xml:space="preserve">9</w:t>
+            </w:r>
+          </w:p>
+        </w:tc>
+        <w:tc>
+          <w:tcPr/>
+          <w:p>
+            <w:pPr>
+              <w:pStyle w:val="Compact"/>
+            </w:pPr>
+            <w:r>
+              <w:t xml:space="preserve">–</w:t>
+            </w:r>
+          </w:p>
+        </w:tc>
+        <w:tc>
+          <w:tcPr/>
+          <w:p>
+            <w:pPr>
+              <w:pStyle w:val="Compact"/>
+            </w:pPr>
+            <w:r>
+              <w:t xml:space="preserve">–</w:t>
+            </w:r>
+          </w:p>
+        </w:tc>
+      </w:tr>
+      <w:tr>
+        <w:tc>
+          <w:tcPr/>
+          <w:p>
+            <w:pPr>
+              <w:pStyle w:val="Compact"/>
+            </w:pPr>
+            <w:r>
+              <w:t xml:space="preserve">fingolimod hydrochloride</w:t>
+            </w:r>
+          </w:p>
+        </w:tc>
+        <w:tc>
+          <w:tcPr/>
+          <w:p>
+            <w:pPr>
+              <w:pStyle w:val="Compact"/>
+            </w:pPr>
+            <w:r>
+              <w:t xml:space="preserve">HUCHEU02</w:t>
+            </w:r>
+          </w:p>
+        </w:tc>
+        <w:tc>
+          <w:tcPr/>
+          <w:p>
+            <w:pPr>
+              <w:pStyle w:val="Compact"/>
+            </w:pPr>
+            <w:r>
+              <w:t xml:space="preserve">10.1017/s0885715615000317</w:t>
+            </w:r>
+          </w:p>
+        </w:tc>
+        <w:tc>
+          <w:tcPr/>
+          <w:p>
+            <w:pPr>
+              <w:pStyle w:val="Compact"/>
+            </w:pPr>
+            <w:r>
+              <w:t xml:space="preserve">synchrotron, 0.4139 Å</w:t>
+            </w:r>
+          </w:p>
+        </w:tc>
+        <w:tc>
+          <w:tcPr/>
+          <w:p>
+            <w:pPr>
+              <w:pStyle w:val="Compact"/>
+            </w:pPr>
+            <w:r>
+              <w:t xml:space="preserve">1.00</w:t>
+            </w:r>
+          </w:p>
+        </w:tc>
+        <w:tc>
+          <w:tcPr/>
+          <w:p>
+            <w:pPr>
+              <w:pStyle w:val="Compact"/>
+            </w:pPr>
+            <w:r>
+              <w:t xml:space="preserve">1</w:t>
+            </w:r>
+          </w:p>
+        </w:tc>
+        <w:tc>
+          <w:tcPr/>
+          <w:p>
+            <w:pPr>
+              <w:pStyle w:val="Compact"/>
+            </w:pPr>
+            <w:r>
+              <w:t xml:space="preserve">1</w:t>
+            </w:r>
+          </w:p>
+        </w:tc>
+        <w:tc>
+          <w:tcPr/>
+          <w:p>
+            <w:pPr>
+              <w:pStyle w:val="Compact"/>
+            </w:pPr>
+            <w:r>
+              <w:t xml:space="preserve">10,374</w:t>
+            </w:r>
+          </w:p>
+        </w:tc>
+        <w:tc>
+          <w:tcPr/>
+          <w:p>
+            <w:pPr>
+              <w:pStyle w:val="Compact"/>
+            </w:pPr>
+            <w:r>
+              <w:t xml:space="preserve">–</w:t>
+            </w:r>
+          </w:p>
+        </w:tc>
+        <w:tc>
+          <w:tcPr/>
+          <w:p>
+            <w:pPr>
+              <w:pStyle w:val="Compact"/>
+            </w:pPr>
+            <w:r>
+              <w:t xml:space="preserve">–</w:t>
+            </w:r>
+          </w:p>
+        </w:tc>
+      </w:tr>
+      <w:tr>
+        <w:tc>
+          <w:tcPr/>
+          <w:p>
+            <w:pPr>
+              <w:pStyle w:val="Compact"/>
+            </w:pPr>
+            <w:r>
+              <w:t xml:space="preserve">levalbuterol hydrochloride</w:t>
+            </w:r>
+          </w:p>
+        </w:tc>
+        <w:tc>
+          <w:tcPr/>
+          <w:p>
+            <w:pPr>
+              <w:pStyle w:val="Compact"/>
+            </w:pPr>
+            <w:r>
+              <w:t xml:space="preserve">OMAJIX</w:t>
+            </w:r>
+          </w:p>
+        </w:tc>
+        <w:tc>
+          <w:tcPr/>
+          <w:p>
+            <w:pPr>
+              <w:pStyle w:val="Compact"/>
+            </w:pPr>
+            <w:r>
+              <w:t xml:space="preserve">10.1017/s0885715615000172</w:t>
+            </w:r>
+          </w:p>
+        </w:tc>
+        <w:tc>
+          <w:tcPr/>
+          <w:p>
+            <w:pPr>
+              <w:pStyle w:val="Compact"/>
+            </w:pPr>
+            <w:r>
+              <w:t xml:space="preserve">synchrotron, 0.4139 Å</w:t>
+            </w:r>
+          </w:p>
+        </w:tc>
+        <w:tc>
+          <w:tcPr/>
+          <w:p>
+            <w:pPr>
+              <w:pStyle w:val="Compact"/>
+            </w:pPr>
+            <w:r>
+              <w:t xml:space="preserve">1.00</w:t>
+            </w:r>
+          </w:p>
+        </w:tc>
+        <w:tc>
+          <w:tcPr/>
+          <w:p>
+            <w:pPr>
+              <w:pStyle w:val="Compact"/>
+            </w:pPr>
+            <w:r>
+              <w:t xml:space="preserve">1</w:t>
+            </w:r>
+          </w:p>
+        </w:tc>
+        <w:tc>
+          <w:tcPr/>
+          <w:p>
+            <w:pPr>
+              <w:pStyle w:val="Compact"/>
+            </w:pPr>
+            <w:r>
+              <w:t xml:space="preserve">1</w:t>
+            </w:r>
+          </w:p>
+        </w:tc>
+        <w:tc>
+          <w:tcPr/>
+          <w:p>
+            <w:pPr>
+              <w:pStyle w:val="Compact"/>
+            </w:pPr>
+            <w:r>
+              <w:t xml:space="preserve">1</w:t>
+            </w:r>
+          </w:p>
+        </w:tc>
+        <w:tc>
+          <w:tcPr/>
+          <w:p>
+            <w:pPr>
+              <w:pStyle w:val="Compact"/>
+            </w:pPr>
+            <w:r>
+              <w:t xml:space="preserve">–</w:t>
+            </w:r>
+          </w:p>
+        </w:tc>
+        <w:tc>
+          <w:tcPr/>
+          <w:p>
+            <w:pPr>
+              <w:pStyle w:val="Compact"/>
+            </w:pPr>
+            <w:r>
+              <w:t xml:space="preserve">–</w:t>
+            </w:r>
+          </w:p>
+        </w:tc>
+      </w:tr>
+      <w:tr>
+        <w:tc>
+          <w:tcPr/>
+          <w:p>
+            <w:pPr>
+              <w:pStyle w:val="Compact"/>
+            </w:pPr>
+            <w:r>
+              <w:t xml:space="preserve">ziprasidone hydrochloride monohydrate</w:t>
+            </w:r>
+          </w:p>
+        </w:tc>
+        <w:tc>
+          <w:tcPr/>
+          <w:p>
+            <w:pPr>
+              <w:pStyle w:val="Compact"/>
+            </w:pPr>
+            <w:r>
+              <w:t xml:space="preserve">OMAKAQ01</w:t>
+            </w:r>
+          </w:p>
+        </w:tc>
+        <w:tc>
+          <w:tcPr/>
+          <w:p>
+            <w:pPr>
+              <w:pStyle w:val="Compact"/>
+            </w:pPr>
+            <w:r>
+              <w:t xml:space="preserve">10.1017/s0885715615000305</w:t>
+            </w:r>
+          </w:p>
+        </w:tc>
+        <w:tc>
+          <w:tcPr/>
+          <w:p>
+            <w:pPr>
+              <w:pStyle w:val="Compact"/>
+            </w:pPr>
+            <w:r>
+              <w:t xml:space="preserve">synchrotron, 0.4139 Å</w:t>
+            </w:r>
+          </w:p>
+        </w:tc>
+        <w:tc>
+          <w:tcPr/>
+          <w:p>
+            <w:pPr>
+              <w:pStyle w:val="Compact"/>
+            </w:pPr>
+            <w:r>
+              <w:t xml:space="preserve">1.00</w:t>
+            </w:r>
+          </w:p>
+        </w:tc>
+        <w:tc>
+          <w:tcPr/>
+          <w:p>
+            <w:pPr>
+              <w:pStyle w:val="Compact"/>
+            </w:pPr>
+            <w:r>
+              <w:t xml:space="preserve">1</w:t>
+            </w:r>
+          </w:p>
+        </w:tc>
+        <w:tc>
+          <w:tcPr/>
+          <w:p>
+            <w:pPr>
+              <w:pStyle w:val="Compact"/>
+            </w:pPr>
+            <w:r>
+              <w:t xml:space="preserve">1</w:t>
+            </w:r>
+          </w:p>
+        </w:tc>
+        <w:tc>
+          <w:tcPr/>
+          <w:p>
+            <w:pPr>
+              <w:pStyle w:val="Compact"/>
+            </w:pPr>
+            <w:r>
+              <w:t xml:space="preserve">3,538</w:t>
+            </w:r>
+          </w:p>
+        </w:tc>
+        <w:tc>
+          <w:tcPr/>
+          <w:p>
+            <w:pPr>
+              <w:pStyle w:val="Compact"/>
+            </w:pPr>
+            <w:r>
+              <w:t xml:space="preserve">–</w:t>
+            </w:r>
+          </w:p>
+        </w:tc>
+        <w:tc>
+          <w:tcPr/>
+          <w:p>
+            <w:pPr>
+              <w:pStyle w:val="Compact"/>
+            </w:pPr>
+            <w:r>
+              <w:t xml:space="preserve">–</w:t>
+            </w:r>
+          </w:p>
+        </w:tc>
+      </w:tr>
+      <w:tr>
+        <w:tc>
+          <w:tcPr/>
+          <w:p>
+            <w:pPr>
+              <w:pStyle w:val="Compact"/>
+            </w:pPr>
+            <w:r>
+              <w:t xml:space="preserve">rilpivirine</w:t>
+            </w:r>
+          </w:p>
+        </w:tc>
+        <w:tc>
+          <w:tcPr/>
+          <w:p>
+            <w:pPr>
+              <w:pStyle w:val="Compact"/>
+            </w:pPr>
+            <w:r>
+              <w:t xml:space="preserve">OMAKOE01</w:t>
+            </w:r>
+          </w:p>
+        </w:tc>
+        <w:tc>
+          <w:tcPr/>
+          <w:p>
+            <w:pPr>
+              <w:pStyle w:val="Compact"/>
+            </w:pPr>
+            <w:r>
+              <w:t xml:space="preserve">10.1017/s0885715615000196</w:t>
+            </w:r>
+          </w:p>
+        </w:tc>
+        <w:tc>
+          <w:tcPr/>
+          <w:p>
+            <w:pPr>
+              <w:pStyle w:val="Compact"/>
+            </w:pPr>
+            <w:r>
+              <w:t xml:space="preserve">synchrotron, 0.4137 Å</w:t>
+            </w:r>
+          </w:p>
+        </w:tc>
+        <w:tc>
+          <w:tcPr/>
+          <w:p>
+            <w:pPr>
+              <w:pStyle w:val="Compact"/>
+            </w:pPr>
+            <w:r>
+              <w:t xml:space="preserve">1.00</w:t>
+            </w:r>
+          </w:p>
+        </w:tc>
+        <w:tc>
+          <w:tcPr/>
+          <w:p>
+            <w:pPr>
+              <w:pStyle w:val="Compact"/>
+            </w:pPr>
+            <w:r>
+              <w:t xml:space="preserve">1</w:t>
+            </w:r>
+          </w:p>
+        </w:tc>
+        <w:tc>
+          <w:tcPr/>
+          <w:p>
+            <w:pPr>
+              <w:pStyle w:val="Compact"/>
+            </w:pPr>
+            <w:r>
+              <w:t xml:space="preserve">1</w:t>
+            </w:r>
+          </w:p>
+        </w:tc>
+        <w:tc>
+          <w:tcPr/>
+          <w:p>
+            <w:pPr>
+              <w:pStyle w:val="Compact"/>
+            </w:pPr>
+            <w:r>
+              <w:t xml:space="preserve">2</w:t>
+            </w:r>
+          </w:p>
+        </w:tc>
+        <w:tc>
+          <w:tcPr/>
+          <w:p>
+            <w:pPr>
+              <w:pStyle w:val="Compact"/>
+            </w:pPr>
+            <w:r>
+              <w:t xml:space="preserve">–</w:t>
+            </w:r>
+          </w:p>
+        </w:tc>
+        <w:tc>
+          <w:tcPr/>
+          <w:p>
+            <w:pPr>
+              <w:pStyle w:val="Compact"/>
+            </w:pPr>
+            <w:r>
+              <w:t xml:space="preserve">–</w:t>
+            </w:r>
+          </w:p>
+        </w:tc>
+      </w:tr>
+      <w:tr>
+        <w:tc>
+          <w:tcPr/>
+          <w:p>
+            <w:pPr>
+              <w:pStyle w:val="Compact"/>
+            </w:pPr>
+            <w:r>
+              <w:t xml:space="preserve">solifenacin hydrogen succinate</w:t>
+            </w:r>
+          </w:p>
+        </w:tc>
+        <w:tc>
+          <w:tcPr/>
+          <w:p>
+            <w:pPr>
+              <w:pStyle w:val="Compact"/>
+            </w:pPr>
+            <w:r>
+              <w:t xml:space="preserve">URATAK</w:t>
+            </w:r>
+          </w:p>
+        </w:tc>
+        <w:tc>
+          <w:tcPr/>
+          <w:p>
+            <w:pPr>
+              <w:pStyle w:val="Compact"/>
+            </w:pPr>
+            <w:r>
+              <w:t xml:space="preserve">10.1017/s0885715615000329</w:t>
+            </w:r>
+          </w:p>
+        </w:tc>
+        <w:tc>
+          <w:tcPr/>
+          <w:p>
+            <w:pPr>
+              <w:pStyle w:val="Compact"/>
+            </w:pPr>
+            <w:r>
+              <w:t xml:space="preserve">synchrotron, 0.4137 Å</w:t>
+            </w:r>
+          </w:p>
+        </w:tc>
+        <w:tc>
+          <w:tcPr/>
+          <w:p>
+            <w:pPr>
+              <w:pStyle w:val="Compact"/>
+            </w:pPr>
+            <w:r>
+              <w:t xml:space="preserve">1.00</w:t>
+            </w:r>
+          </w:p>
+        </w:tc>
+        <w:tc>
+          <w:tcPr/>
+          <w:p>
+            <w:pPr>
+              <w:pStyle w:val="Compact"/>
+            </w:pPr>
+            <w:r>
+              <w:t xml:space="preserve">1</w:t>
+            </w:r>
+          </w:p>
+        </w:tc>
+        <w:tc>
+          <w:tcPr/>
+          <w:p>
+            <w:pPr>
+              <w:pStyle w:val="Compact"/>
+            </w:pPr>
+            <w:r>
+              <w:t xml:space="preserve">1</w:t>
+            </w:r>
+          </w:p>
+        </w:tc>
+        <w:tc>
+          <w:tcPr/>
+          <w:p>
+            <w:pPr>
+              <w:pStyle w:val="Compact"/>
+            </w:pPr>
+            <w:r>
+              <w:t xml:space="preserve">255</w:t>
+            </w:r>
+          </w:p>
+        </w:tc>
+        <w:tc>
+          <w:tcPr/>
+          <w:p>
+            <w:pPr>
+              <w:pStyle w:val="Compact"/>
+            </w:pPr>
+            <w:r>
+              <w:t xml:space="preserve">–</w:t>
+            </w:r>
+          </w:p>
+        </w:tc>
+        <w:tc>
+          <w:tcPr/>
+          <w:p>
+            <w:pPr>
+              <w:pStyle w:val="Compact"/>
+            </w:pPr>
+            <w:r>
+              <w:t xml:space="preserve">–</w:t>
+            </w:r>
+          </w:p>
+        </w:tc>
+      </w:tr>
+      <w:tr>
+        <w:tc>
+          <w:tcPr/>
+          <w:p>
+            <w:pPr>
+              <w:pStyle w:val="Compact"/>
+            </w:pPr>
+            <w:r>
+              <w:t xml:space="preserve">lacosamide form I</w:t>
+            </w:r>
+          </w:p>
+        </w:tc>
+        <w:tc>
+          <w:tcPr/>
+          <w:p>
+            <w:pPr>
+              <w:pStyle w:val="Compact"/>
+            </w:pPr>
+            <w:r>
+              <w:t xml:space="preserve">URATIS</w:t>
+            </w:r>
+          </w:p>
+        </w:tc>
+        <w:tc>
+          <w:tcPr/>
+          <w:p>
+            <w:pPr>
+              <w:pStyle w:val="Compact"/>
+            </w:pPr>
+            <w:r>
+              <w:t xml:space="preserve">10.1017/s0885715615000378</w:t>
+            </w:r>
+          </w:p>
+        </w:tc>
+        <w:tc>
+          <w:tcPr/>
+          <w:p>
+            <w:pPr>
+              <w:pStyle w:val="Compact"/>
+            </w:pPr>
+            <w:r>
+              <w:t xml:space="preserve">synchrotron, 0.4137 Å</w:t>
+            </w:r>
+          </w:p>
+        </w:tc>
+        <w:tc>
+          <w:tcPr/>
+          <w:p>
+            <w:pPr>
+              <w:pStyle w:val="Compact"/>
+            </w:pPr>
+            <w:r>
+              <w:t xml:space="preserve">1.00</w:t>
+            </w:r>
+          </w:p>
+        </w:tc>
+        <w:tc>
+          <w:tcPr/>
+          <w:p>
+            <w:pPr>
+              <w:pStyle w:val="Compact"/>
+            </w:pPr>
+            <w:r>
+              <w:t xml:space="preserve">1</w:t>
+            </w:r>
+          </w:p>
+        </w:tc>
+        <w:tc>
+          <w:tcPr/>
+          <w:p>
+            <w:pPr>
+              <w:pStyle w:val="Compact"/>
+            </w:pPr>
+            <w:r>
+              <w:t xml:space="preserve">1</w:t>
+            </w:r>
+          </w:p>
+        </w:tc>
+        <w:tc>
+          <w:tcPr/>
+          <w:p>
+            <w:pPr>
+              <w:pStyle w:val="Compact"/>
+            </w:pPr>
+            <w:r>
+              <w:t xml:space="preserve">867</w:t>
+            </w:r>
+          </w:p>
+        </w:tc>
+        <w:tc>
+          <w:tcPr/>
+          <w:p>
+            <w:pPr>
+              <w:pStyle w:val="Compact"/>
+            </w:pPr>
+            <w:r>
+              <w:t xml:space="preserve">–</w:t>
+            </w:r>
+          </w:p>
+        </w:tc>
+        <w:tc>
+          <w:tcPr/>
+          <w:p>
+            <w:pPr>
+              <w:pStyle w:val="Compact"/>
+            </w:pPr>
+            <w:r>
+              <w:t xml:space="preserve">–</w:t>
+            </w:r>
+          </w:p>
+        </w:tc>
+      </w:tr>
+      <w:tr>
+        <w:tc>
+          <w:tcPr/>
+          <w:p>
+            <w:pPr>
+              <w:pStyle w:val="Compact"/>
+            </w:pPr>
+            <w:r>
+              <w:t xml:space="preserve">nilotinib</w:t>
+            </w:r>
+          </w:p>
+        </w:tc>
+        <w:tc>
+          <w:tcPr/>
+          <w:p>
+            <w:pPr>
+              <w:pStyle w:val="Compact"/>
+            </w:pPr>
+            <w:r>
+              <w:t xml:space="preserve">URAVUG</w:t>
+            </w:r>
+          </w:p>
+        </w:tc>
+        <w:tc>
+          <w:tcPr/>
+          <w:p>
+            <w:pPr>
+              <w:pStyle w:val="Compact"/>
+            </w:pPr>
+            <w:r>
+              <w:t xml:space="preserve">10.1017/s0885715615000512</w:t>
+            </w:r>
+          </w:p>
+        </w:tc>
+        <w:tc>
+          <w:tcPr/>
+          <w:p>
+            <w:pPr>
+              <w:pStyle w:val="Compact"/>
+            </w:pPr>
+            <w:r>
+              <w:t xml:space="preserve">synchrotron, 0.4137 Å</w:t>
+            </w:r>
+          </w:p>
+        </w:tc>
+        <w:tc>
+          <w:tcPr/>
+          <w:p>
+            <w:pPr>
+              <w:pStyle w:val="Compact"/>
+            </w:pPr>
+            <w:r>
+              <w:t xml:space="preserve">1.00</w:t>
+            </w:r>
+          </w:p>
+        </w:tc>
+        <w:tc>
+          <w:tcPr/>
+          <w:p>
+            <w:pPr>
+              <w:pStyle w:val="Compact"/>
+            </w:pPr>
+            <w:r>
+              <w:t xml:space="preserve">1</w:t>
+            </w:r>
+          </w:p>
+        </w:tc>
+        <w:tc>
+          <w:tcPr/>
+          <w:p>
+            <w:pPr>
+              <w:pStyle w:val="Compact"/>
+            </w:pPr>
+            <w:r>
+              <w:t xml:space="preserve">1</w:t>
+            </w:r>
+          </w:p>
+        </w:tc>
+        <w:tc>
+          <w:tcPr/>
+          <w:p>
+            <w:pPr>
+              <w:pStyle w:val="Compact"/>
+            </w:pPr>
+            <w:r>
+              <w:t xml:space="preserve">4,348</w:t>
+            </w:r>
+          </w:p>
+        </w:tc>
+        <w:tc>
+          <w:tcPr/>
+          <w:p>
+            <w:pPr>
+              <w:pStyle w:val="Compact"/>
+            </w:pPr>
+            <w:r>
+              <w:t xml:space="preserve">–</w:t>
+            </w:r>
+          </w:p>
+        </w:tc>
+        <w:tc>
+          <w:tcPr/>
+          <w:p>
+            <w:pPr>
+              <w:pStyle w:val="Compact"/>
+            </w:pPr>
+            <w:r>
+              <w:t xml:space="preserve">–</w:t>
+            </w:r>
+          </w:p>
+        </w:tc>
+      </w:tr>
+      <w:tr>
+        <w:tc>
+          <w:tcPr/>
+          <w:p>
+            <w:pPr>
+              <w:pStyle w:val="Compact"/>
+            </w:pPr>
+            <w:r>
+              <w:t xml:space="preserve">sitagliptin dihydrogen phosphate monohydrate</w:t>
+            </w:r>
+          </w:p>
+        </w:tc>
+        <w:tc>
+          <w:tcPr/>
+          <w:p>
+            <w:pPr>
+              <w:pStyle w:val="Compact"/>
+            </w:pPr>
+            <w:r>
+              <w:t xml:space="preserve">URAWUH</w:t>
+            </w:r>
+          </w:p>
+        </w:tc>
+        <w:tc>
+          <w:tcPr/>
+          <w:p>
+            <w:pPr>
+              <w:pStyle w:val="Compact"/>
+            </w:pPr>
+            <w:r>
+              <w:t xml:space="preserve">10.1017/s0885715615000755</w:t>
+            </w:r>
+          </w:p>
+        </w:tc>
+        <w:tc>
+          <w:tcPr/>
+          <w:p>
+            <w:pPr>
+              <w:pStyle w:val="Compact"/>
+            </w:pPr>
+            <w:r>
+              <w:t xml:space="preserve">synchrotron, 0.4139 Å</w:t>
+            </w:r>
+          </w:p>
+        </w:tc>
+        <w:tc>
+          <w:tcPr/>
+          <w:p>
+            <w:pPr>
+              <w:pStyle w:val="Compact"/>
+            </w:pPr>
+            <w:r>
+              <w:t xml:space="preserve">1.00</w:t>
+            </w:r>
+          </w:p>
+        </w:tc>
+        <w:tc>
+          <w:tcPr/>
+          <w:p>
+            <w:pPr>
+              <w:pStyle w:val="Compact"/>
+            </w:pPr>
+            <w:r>
+              <w:t xml:space="preserve">1</w:t>
+            </w:r>
+          </w:p>
+        </w:tc>
+        <w:tc>
+          <w:tcPr/>
+          <w:p>
+            <w:pPr>
+              <w:pStyle w:val="Compact"/>
+            </w:pPr>
+            <w:r>
+              <w:t xml:space="preserve">1</w:t>
+            </w:r>
+          </w:p>
+        </w:tc>
+        <w:tc>
+          <w:tcPr/>
+          <w:p>
+            <w:pPr>
+              <w:pStyle w:val="Compact"/>
+            </w:pPr>
+            <w:r>
+              <w:t xml:space="preserve">10</w:t>
+            </w:r>
+          </w:p>
+        </w:tc>
+        <w:tc>
+          <w:tcPr/>
+          <w:p>
+            <w:pPr>
+              <w:pStyle w:val="Compact"/>
+            </w:pPr>
+            <w:r>
+              <w:t xml:space="preserve">–</w:t>
+            </w:r>
+          </w:p>
+        </w:tc>
+        <w:tc>
+          <w:tcPr/>
+          <w:p>
+            <w:pPr>
+              <w:pStyle w:val="Compact"/>
+            </w:pPr>
+            <w:r>
+              <w:t xml:space="preserve">–</w:t>
+            </w:r>
+          </w:p>
+        </w:tc>
+      </w:tr>
+      <w:tr>
+        <w:tc>
+          <w:tcPr/>
+          <w:p>
+            <w:pPr>
+              <w:pStyle w:val="Compact"/>
+            </w:pPr>
+            <w:r>
+              <w:t xml:space="preserve">paliperidone</w:t>
+            </w:r>
+          </w:p>
+        </w:tc>
+        <w:tc>
+          <w:tcPr/>
+          <w:p>
+            <w:pPr>
+              <w:pStyle w:val="Compact"/>
+            </w:pPr>
+            <w:r>
+              <w:t xml:space="preserve">YAGRIJ01</w:t>
+            </w:r>
+          </w:p>
+        </w:tc>
+        <w:tc>
+          <w:tcPr/>
+          <w:p>
+            <w:pPr>
+              <w:pStyle w:val="Compact"/>
+            </w:pPr>
+            <w:r>
+              <w:t xml:space="preserve">10.1017/s0885715616000087</w:t>
+            </w:r>
+          </w:p>
+        </w:tc>
+        <w:tc>
+          <w:tcPr/>
+          <w:p>
+            <w:pPr>
+              <w:pStyle w:val="Compact"/>
+            </w:pPr>
+            <w:r>
+              <w:t xml:space="preserve">synchrotron, 0.4139 Å</w:t>
+            </w:r>
+          </w:p>
+        </w:tc>
+        <w:tc>
+          <w:tcPr/>
+          <w:p>
+            <w:pPr>
+              <w:pStyle w:val="Compact"/>
+            </w:pPr>
+            <w:r>
+              <w:t xml:space="preserve">1.00</w:t>
+            </w:r>
+          </w:p>
+        </w:tc>
+        <w:tc>
+          <w:tcPr/>
+          <w:p>
+            <w:pPr>
+              <w:pStyle w:val="Compact"/>
+            </w:pPr>
+            <w:r>
+              <w:t xml:space="preserve">1</w:t>
+            </w:r>
+          </w:p>
+        </w:tc>
+        <w:tc>
+          <w:tcPr/>
+          <w:p>
+            <w:pPr>
+              <w:pStyle w:val="Compact"/>
+            </w:pPr>
+            <w:r>
+              <w:t xml:space="preserve">1</w:t>
+            </w:r>
+          </w:p>
+        </w:tc>
+        <w:tc>
+          <w:tcPr/>
+          <w:p>
+            <w:pPr>
+              <w:pStyle w:val="Compact"/>
+            </w:pPr>
+            <w:r>
+              <w:t xml:space="preserve">107</w:t>
+            </w:r>
+          </w:p>
+        </w:tc>
+        <w:tc>
+          <w:tcPr/>
+          <w:p>
+            <w:pPr>
+              <w:pStyle w:val="Compact"/>
+            </w:pPr>
+            <w:r>
+              <w:t xml:space="preserve">–</w:t>
+            </w:r>
+          </w:p>
+        </w:tc>
+        <w:tc>
+          <w:tcPr/>
+          <w:p>
+            <w:pPr>
+              <w:pStyle w:val="Compact"/>
+            </w:pPr>
+            <w:r>
+              <w:t xml:space="preserve">–</w:t>
+            </w:r>
+          </w:p>
+        </w:tc>
+      </w:tr>
+      <w:tr>
+        <w:tc>
+          <w:tcPr/>
+          <w:p>
+            <w:pPr>
+              <w:pStyle w:val="Compact"/>
+            </w:pPr>
+            <w:r>
+              <w:t xml:space="preserve">paliperidone palmitate</w:t>
+            </w:r>
+          </w:p>
+        </w:tc>
+        <w:tc>
+          <w:tcPr/>
+          <w:p>
+            <w:pPr>
+              <w:pStyle w:val="Compact"/>
+            </w:pPr>
+            <w:r>
+              <w:t xml:space="preserve">NOKFUR</w:t>
+            </w:r>
+          </w:p>
+        </w:tc>
+        <w:tc>
+          <w:tcPr/>
+          <w:p>
+            <w:pPr>
+              <w:pStyle w:val="Compact"/>
+            </w:pPr>
+            <w:r>
+              <w:t xml:space="preserve">10.1017/s0885715617000896</w:t>
+            </w:r>
+          </w:p>
+        </w:tc>
+        <w:tc>
+          <w:tcPr/>
+          <w:p>
+            <w:pPr>
+              <w:pStyle w:val="Compact"/>
+            </w:pPr>
+            <w:r>
+              <w:t xml:space="preserve">synchrotron, 0.4133 Å</w:t>
+            </w:r>
+          </w:p>
+        </w:tc>
+        <w:tc>
+          <w:tcPr/>
+          <w:p>
+            <w:pPr>
+              <w:pStyle w:val="Compact"/>
+            </w:pPr>
+            <w:r>
+              <w:t xml:space="preserve">1.00</w:t>
+            </w:r>
+          </w:p>
+        </w:tc>
+        <w:tc>
+          <w:tcPr/>
+          <w:p>
+            <w:pPr>
+              <w:pStyle w:val="Compact"/>
+            </w:pPr>
+            <w:r>
+              <w:t xml:space="preserve">1</w:t>
+            </w:r>
+          </w:p>
+        </w:tc>
+        <w:tc>
+          <w:tcPr/>
+          <w:p>
+            <w:pPr>
+              <w:pStyle w:val="Compact"/>
+            </w:pPr>
+            <w:r>
+              <w:t xml:space="preserve">1</w:t>
+            </w:r>
+          </w:p>
+        </w:tc>
+        <w:tc>
+          <w:tcPr/>
+          <w:p>
+            <w:pPr>
+              <w:pStyle w:val="Compact"/>
+            </w:pPr>
+            <w:r>
+              <w:t xml:space="preserve">95</w:t>
+            </w:r>
+          </w:p>
+        </w:tc>
+        <w:tc>
+          <w:tcPr/>
+          <w:p>
+            <w:pPr>
+              <w:pStyle w:val="Compact"/>
+            </w:pPr>
+            <w:r>
+              <w:t xml:space="preserve">1</w:t>
+            </w:r>
+          </w:p>
+        </w:tc>
+        <w:tc>
+          <w:tcPr/>
+          <w:p>
+            <w:pPr>
+              <w:pStyle w:val="Compact"/>
+            </w:pPr>
+            <w:r>
+              <w:t xml:space="preserve">95</w:t>
+            </w:r>
+          </w:p>
+        </w:tc>
+      </w:tr>
+      <w:tr>
+        <w:tc>
+          <w:tcPr/>
+          <w:p>
+            <w:pPr>
+              <w:pStyle w:val="Compact"/>
+            </w:pPr>
+            <w:r>
+              <w:t xml:space="preserve">hydrocortisone acetate</w:t>
+            </w:r>
+          </w:p>
+        </w:tc>
+        <w:tc>
+          <w:tcPr/>
+          <w:p>
+            <w:pPr>
+              <w:pStyle w:val="Compact"/>
+            </w:pPr>
+            <w:r>
+              <w:t xml:space="preserve">ZZZGCU01</w:t>
+            </w:r>
+          </w:p>
+        </w:tc>
+        <w:tc>
+          <w:tcPr/>
+          <w:p>
+            <w:pPr>
+              <w:pStyle w:val="Compact"/>
+            </w:pPr>
+            <w:r>
+              <w:t xml:space="preserve">10.1017/s0885715616000713</w:t>
+            </w:r>
+          </w:p>
+        </w:tc>
+        <w:tc>
+          <w:tcPr/>
+          <w:p>
+            <w:pPr>
+              <w:pStyle w:val="Compact"/>
+            </w:pPr>
+            <w:r>
+              <w:t xml:space="preserve">synchrotron, 0.4133 Å</w:t>
+            </w:r>
+          </w:p>
+        </w:tc>
+        <w:tc>
+          <w:tcPr/>
+          <w:p>
+            <w:pPr>
+              <w:pStyle w:val="Compact"/>
+            </w:pPr>
+            <w:r>
+              <w:t xml:space="preserve">1.00</w:t>
+            </w:r>
+          </w:p>
+        </w:tc>
+        <w:tc>
+          <w:tcPr/>
+          <w:p>
+            <w:pPr>
+              <w:pStyle w:val="Compact"/>
+            </w:pPr>
+            <w:r>
+              <w:t xml:space="preserve">1</w:t>
+            </w:r>
+          </w:p>
+        </w:tc>
+        <w:tc>
+          <w:tcPr/>
+          <w:p>
+            <w:pPr>
+              <w:pStyle w:val="Compact"/>
+            </w:pPr>
+            <w:r>
+              <w:t xml:space="preserve">1</w:t>
+            </w:r>
+          </w:p>
+        </w:tc>
+        <w:tc>
+          <w:tcPr/>
+          <w:p>
+            <w:pPr>
+              <w:pStyle w:val="Compact"/>
+            </w:pPr>
+            <w:r>
+              <w:t xml:space="preserve">1</w:t>
+            </w:r>
+          </w:p>
+        </w:tc>
+        <w:tc>
+          <w:tcPr/>
+          <w:p>
+            <w:pPr>
+              <w:pStyle w:val="Compact"/>
+            </w:pPr>
+            <w:r>
+              <w:t xml:space="preserve">–</w:t>
+            </w:r>
+          </w:p>
+        </w:tc>
+        <w:tc>
+          <w:tcPr/>
+          <w:p>
+            <w:pPr>
+              <w:pStyle w:val="Compact"/>
+            </w:pPr>
+            <w:r>
+              <w:t xml:space="preserve">–</w:t>
+            </w:r>
+          </w:p>
+        </w:tc>
+      </w:tr>
+      <w:tr>
+        <w:tc>
+          <w:tcPr/>
+          <w:p>
+            <w:pPr>
+              <w:pStyle w:val="Compact"/>
+            </w:pPr>
+            <w:r>
+              <w:t xml:space="preserve">estradiol valerate</w:t>
+            </w:r>
+          </w:p>
+        </w:tc>
+        <w:tc>
+          <w:tcPr/>
+          <w:p>
+            <w:pPr>
+              <w:pStyle w:val="Compact"/>
+            </w:pPr>
+            <w:r>
+              <w:t xml:space="preserve">DOVGEC02</w:t>
+            </w:r>
+          </w:p>
+        </w:tc>
+        <w:tc>
+          <w:tcPr/>
+          <w:p>
+            <w:pPr>
+              <w:pStyle w:val="Compact"/>
+            </w:pPr>
+            <w:r>
+              <w:t xml:space="preserve">10.1017/s0885715618000039</w:t>
+            </w:r>
+          </w:p>
+        </w:tc>
+        <w:tc>
+          <w:tcPr/>
+          <w:p>
+            <w:pPr>
+              <w:pStyle w:val="Compact"/>
+            </w:pPr>
+            <w:r>
+              <w:t xml:space="preserve">synchrotron, 0.4142 Å</w:t>
+            </w:r>
+          </w:p>
+        </w:tc>
+        <w:tc>
+          <w:tcPr/>
+          <w:p>
+            <w:pPr>
+              <w:pStyle w:val="Compact"/>
+            </w:pPr>
+            <w:r>
+              <w:t xml:space="preserve">1.00</w:t>
+            </w:r>
+          </w:p>
+        </w:tc>
+        <w:tc>
+          <w:tcPr/>
+          <w:p>
+            <w:pPr>
+              <w:pStyle w:val="Compact"/>
+            </w:pPr>
+            <w:r>
+              <w:t xml:space="preserve">2</w:t>
+            </w:r>
+          </w:p>
+        </w:tc>
+        <w:tc>
+          <w:tcPr/>
+          <w:p>
+            <w:pPr>
+              <w:pStyle w:val="Compact"/>
+            </w:pPr>
+            <w:r>
+              <w:t xml:space="preserve">1</w:t>
+            </w:r>
+          </w:p>
+        </w:tc>
+        <w:tc>
+          <w:tcPr/>
+          <w:p>
+            <w:pPr>
+              <w:pStyle w:val="Compact"/>
+            </w:pPr>
+            <w:r>
+              <w:t xml:space="preserve">88</w:t>
+            </w:r>
+          </w:p>
+        </w:tc>
+        <w:tc>
+          <w:tcPr/>
+          <w:p>
+            <w:pPr>
+              <w:pStyle w:val="Compact"/>
+            </w:pPr>
+            <w:r>
+              <w:t xml:space="preserve">–</w:t>
+            </w:r>
+          </w:p>
+        </w:tc>
+        <w:tc>
+          <w:tcPr/>
+          <w:p>
+            <w:pPr>
+              <w:pStyle w:val="Compact"/>
+            </w:pPr>
+            <w:r>
+              <w:t xml:space="preserve">–</w:t>
+            </w:r>
+          </w:p>
+        </w:tc>
+      </w:tr>
+      <w:tr>
+        <w:tc>
+          <w:tcPr/>
+          <w:p>
+            <w:pPr>
+              <w:pStyle w:val="Compact"/>
+            </w:pPr>
+            <w:r>
+              <w:t xml:space="preserve">curcumin</w:t>
+            </w:r>
+          </w:p>
+        </w:tc>
+        <w:tc>
+          <w:tcPr/>
+          <w:p>
+            <w:pPr>
+              <w:pStyle w:val="Compact"/>
+            </w:pPr>
+            <w:r>
+              <w:t xml:space="preserve">BINMEQ09</w:t>
+            </w:r>
+          </w:p>
+        </w:tc>
+        <w:tc>
+          <w:tcPr/>
+          <w:p>
+            <w:pPr>
+              <w:pStyle w:val="Compact"/>
+            </w:pPr>
+            <w:r>
+              <w:t xml:space="preserve">10.1017/s0885715614001018</w:t>
+            </w:r>
+          </w:p>
+        </w:tc>
+        <w:tc>
+          <w:tcPr/>
+          <w:p>
+            <w:pPr>
+              <w:pStyle w:val="Compact"/>
+            </w:pPr>
+            <w:r>
+              <w:t xml:space="preserve">synchrotron, 0.6888 Å</w:t>
+            </w:r>
+          </w:p>
+        </w:tc>
+        <w:tc>
+          <w:tcPr/>
+          <w:p>
+            <w:pPr>
+              <w:pStyle w:val="Compact"/>
+            </w:pPr>
+            <w:r>
+              <w:t xml:space="preserve">1.00</w:t>
+            </w:r>
+          </w:p>
+        </w:tc>
+        <w:tc>
+          <w:tcPr/>
+          <w:p>
+            <w:pPr>
+              <w:pStyle w:val="Compact"/>
+            </w:pPr>
+            <w:r>
+              <w:t xml:space="preserve">1</w:t>
+            </w:r>
+          </w:p>
+        </w:tc>
+        <w:tc>
+          <w:tcPr/>
+          <w:p>
+            <w:pPr>
+              <w:pStyle w:val="Compact"/>
+            </w:pPr>
+            <w:r>
+              <w:t xml:space="preserve">1</w:t>
+            </w:r>
+          </w:p>
+        </w:tc>
+        <w:tc>
+          <w:tcPr/>
+          <w:p>
+            <w:pPr>
+              <w:pStyle w:val="Compact"/>
+            </w:pPr>
+            <w:r>
+              <w:t xml:space="preserve">36</w:t>
+            </w:r>
+          </w:p>
+        </w:tc>
+        <w:tc>
+          <w:tcPr/>
+          <w:p>
+            <w:pPr>
+              <w:pStyle w:val="Compact"/>
+            </w:pPr>
+            <w:r>
+              <w:t xml:space="preserve">3</w:t>
+            </w:r>
+          </w:p>
+        </w:tc>
+        <w:tc>
+          <w:tcPr/>
+          <w:p>
+            <w:pPr>
+              <w:pStyle w:val="Compact"/>
+            </w:pPr>
+            <w:r>
+              <w:t xml:space="preserve">48</w:t>
+            </w:r>
+          </w:p>
+        </w:tc>
+      </w:tr>
+      <w:tr>
+        <w:tc>
+          <w:tcPr/>
+          <w:p>
+            <w:pPr>
+              <w:pStyle w:val="Compact"/>
+            </w:pPr>
+            <w:r>
+              <w:t xml:space="preserve">saxagliptin</w:t>
+            </w:r>
+          </w:p>
+        </w:tc>
+        <w:tc>
+          <w:tcPr/>
+          <w:p>
+            <w:pPr>
+              <w:pStyle w:val="Compact"/>
+            </w:pPr>
+            <w:r>
+              <w:t xml:space="preserve">HAQQUN02</w:t>
+            </w:r>
+          </w:p>
+        </w:tc>
+        <w:tc>
+          <w:tcPr/>
+          <w:p>
+            <w:pPr>
+              <w:pStyle w:val="Compact"/>
+            </w:pPr>
+            <w:r>
+              <w:t xml:space="preserve">10.1017/s0885715615000548</w:t>
+            </w:r>
+          </w:p>
+        </w:tc>
+        <w:tc>
+          <w:tcPr/>
+          <w:p>
+            <w:pPr>
+              <w:pStyle w:val="Compact"/>
+            </w:pPr>
+            <w:r>
+              <w:t xml:space="preserve">synchrotron, 0.4137 Å</w:t>
+            </w:r>
+          </w:p>
+        </w:tc>
+        <w:tc>
+          <w:tcPr/>
+          <w:p>
+            <w:pPr>
+              <w:pStyle w:val="Compact"/>
+            </w:pPr>
+            <w:r>
+              <w:t xml:space="preserve">1.00</w:t>
+            </w:r>
+          </w:p>
+        </w:tc>
+        <w:tc>
+          <w:tcPr/>
+          <w:p>
+            <w:pPr>
+              <w:pStyle w:val="Compact"/>
+            </w:pPr>
+            <w:r>
+              <w:t xml:space="preserve">1</w:t>
+            </w:r>
+          </w:p>
+        </w:tc>
+        <w:tc>
+          <w:tcPr/>
+          <w:p>
+            <w:pPr>
+              <w:pStyle w:val="Compact"/>
+            </w:pPr>
+            <w:r>
+              <w:t xml:space="preserve">1</w:t>
+            </w:r>
+          </w:p>
+        </w:tc>
+        <w:tc>
+          <w:tcPr/>
+          <w:p>
+            <w:pPr>
+              <w:pStyle w:val="Compact"/>
+            </w:pPr>
+            <w:r>
+              <w:t xml:space="preserve">450</w:t>
+            </w:r>
+          </w:p>
+        </w:tc>
+        <w:tc>
+          <w:tcPr/>
+          <w:p>
+            <w:pPr>
+              <w:pStyle w:val="Compact"/>
+            </w:pPr>
+            <w:r>
+              <w:t xml:space="preserve">–</w:t>
+            </w:r>
+          </w:p>
+        </w:tc>
+        <w:tc>
+          <w:tcPr/>
+          <w:p>
+            <w:pPr>
+              <w:pStyle w:val="Compact"/>
+            </w:pPr>
+            <w:r>
+              <w:t xml:space="preserve">–</w:t>
+            </w:r>
+          </w:p>
+        </w:tc>
+      </w:tr>
+      <w:tr>
+        <w:tc>
+          <w:tcPr/>
+          <w:p>
+            <w:pPr>
+              <w:pStyle w:val="Compact"/>
+            </w:pPr>
+            <w:r>
+              <w:t xml:space="preserve">trandolapril</w:t>
+            </w:r>
+          </w:p>
+        </w:tc>
+        <w:tc>
+          <w:tcPr/>
+          <w:p>
+            <w:pPr>
+              <w:pStyle w:val="Compact"/>
+            </w:pPr>
+            <w:r>
+              <w:t xml:space="preserve">IQISAE</w:t>
+            </w:r>
+          </w:p>
+        </w:tc>
+        <w:tc>
+          <w:tcPr/>
+          <w:p>
+            <w:pPr>
+              <w:pStyle w:val="Compact"/>
+            </w:pPr>
+            <w:r>
+              <w:t xml:space="preserve">10.1017/s0885715616000294</w:t>
+            </w:r>
+          </w:p>
+        </w:tc>
+        <w:tc>
+          <w:tcPr/>
+          <w:p>
+            <w:pPr>
+              <w:pStyle w:val="Compact"/>
+            </w:pPr>
+            <w:r>
+              <w:t xml:space="preserve">lab Cu, 1.5406 Å</w:t>
+            </w:r>
+          </w:p>
+        </w:tc>
+        <w:tc>
+          <w:tcPr/>
+          <w:p>
+            <w:pPr>
+              <w:pStyle w:val="Compact"/>
+            </w:pPr>
+            <w:r>
+              <w:t xml:space="preserve">0.78</w:t>
+            </w:r>
+          </w:p>
+        </w:tc>
+        <w:tc>
+          <w:tcPr/>
+          <w:p>
+            <w:pPr>
+              <w:pStyle w:val="Compact"/>
+            </w:pPr>
+            <w:r>
+              <w:t xml:space="preserve">1</w:t>
+            </w:r>
+          </w:p>
+        </w:tc>
+        <w:tc>
+          <w:tcPr/>
+          <w:p>
+            <w:pPr>
+              <w:pStyle w:val="Compact"/>
+            </w:pPr>
+            <w:r>
+              <w:t xml:space="preserve">1</w:t>
+            </w:r>
+          </w:p>
+        </w:tc>
+        <w:tc>
+          <w:tcPr/>
+          <w:p>
+            <w:pPr>
+              <w:pStyle w:val="Compact"/>
+            </w:pPr>
+            <w:r>
+              <w:t xml:space="preserve">263,727</w:t>
+            </w:r>
+          </w:p>
+        </w:tc>
+        <w:tc>
+          <w:tcPr/>
+          <w:p>
+            <w:pPr>
+              <w:pStyle w:val="Compact"/>
+            </w:pPr>
+            <w:r>
+              <w:t xml:space="preserve">–</w:t>
+            </w:r>
+          </w:p>
+        </w:tc>
+        <w:tc>
+          <w:tcPr/>
+          <w:p>
+            <w:pPr>
+              <w:pStyle w:val="Compact"/>
+            </w:pPr>
+            <w:r>
+              <w:t xml:space="preserve">–</w:t>
+            </w:r>
+          </w:p>
+        </w:tc>
+      </w:tr>
+      <w:tr>
+        <w:tc>
+          <w:tcPr/>
+          <w:p>
+            <w:pPr>
+              <w:pStyle w:val="Compact"/>
+            </w:pPr>
+            <w:r>
+              <w:t xml:space="preserve">trandolapril</w:t>
+            </w:r>
+          </w:p>
+        </w:tc>
+        <w:tc>
+          <w:tcPr/>
+          <w:p>
+            <w:pPr>
+              <w:pStyle w:val="Compact"/>
+            </w:pPr>
+            <w:r>
+              <w:t xml:space="preserve">IQISAE</w:t>
+            </w:r>
+          </w:p>
+        </w:tc>
+        <w:tc>
+          <w:tcPr/>
+          <w:p>
+            <w:pPr>
+              <w:pStyle w:val="Compact"/>
+            </w:pPr>
+            <w:r>
+              <w:t xml:space="preserve">10.1017/s0885715616000294</w:t>
+            </w:r>
+          </w:p>
+        </w:tc>
+        <w:tc>
+          <w:tcPr/>
+          <w:p>
+            <w:pPr>
+              <w:pStyle w:val="Compact"/>
+            </w:pPr>
+            <w:r>
+              <w:t xml:space="preserve">lab Cu, 1.5406 Å</w:t>
+            </w:r>
+          </w:p>
+        </w:tc>
+        <w:tc>
+          <w:tcPr/>
+          <w:p>
+            <w:pPr>
+              <w:pStyle w:val="Compact"/>
+            </w:pPr>
+            <w:r>
+              <w:t xml:space="preserve">1.00</w:t>
+            </w:r>
+          </w:p>
+        </w:tc>
+        <w:tc>
+          <w:tcPr/>
+          <w:p>
+            <w:pPr>
+              <w:pStyle w:val="Compact"/>
+            </w:pPr>
+            <w:r>
+              <w:t xml:space="preserve">1</w:t>
+            </w:r>
+          </w:p>
+        </w:tc>
+        <w:tc>
+          <w:tcPr/>
+          <w:p>
+            <w:pPr>
+              <w:pStyle w:val="Compact"/>
+            </w:pPr>
+            <w:r>
+              <w:t xml:space="preserve">1</w:t>
+            </w:r>
+          </w:p>
+        </w:tc>
+        <w:tc>
+          <w:tcPr/>
+          <w:p>
+            <w:pPr>
+              <w:pStyle w:val="Compact"/>
+            </w:pPr>
+            <w:r>
+              <w:t xml:space="preserve">369</w:t>
+            </w:r>
+          </w:p>
+        </w:tc>
+        <w:tc>
+          <w:tcPr/>
+          <w:p>
+            <w:pPr>
+              <w:pStyle w:val="Compact"/>
+            </w:pPr>
+            <w:r>
+              <w:t xml:space="preserve">–</w:t>
+            </w:r>
+          </w:p>
+        </w:tc>
+        <w:tc>
+          <w:tcPr/>
+          <w:p>
+            <w:pPr>
+              <w:pStyle w:val="Compact"/>
+            </w:pPr>
+            <w:r>
+              <w:t xml:space="preserve">–</w:t>
+            </w:r>
+          </w:p>
+        </w:tc>
+      </w:tr>
+      <w:tr>
+        <w:tc>
+          <w:tcPr/>
+          <w:p>
+            <w:pPr>
+              <w:pStyle w:val="Compact"/>
+            </w:pPr>
+            <w:r>
+              <w:t xml:space="preserve">donepezil hydrochloride form III</w:t>
+            </w:r>
+          </w:p>
+        </w:tc>
+        <w:tc>
+          <w:tcPr/>
+          <w:p>
+            <w:pPr>
+              <w:pStyle w:val="Compact"/>
+            </w:pPr>
+            <w:r>
+              <w:t xml:space="preserve">EDUPUS</w:t>
+            </w:r>
+          </w:p>
+        </w:tc>
+        <w:tc>
+          <w:tcPr/>
+          <w:p>
+            <w:pPr>
+              <w:pStyle w:val="Compact"/>
+            </w:pPr>
+            <w:r>
+              <w:t xml:space="preserve">10.1017/s0885715621000415</w:t>
+            </w:r>
+          </w:p>
+        </w:tc>
+        <w:tc>
+          <w:tcPr/>
+          <w:p>
+            <w:pPr>
+              <w:pStyle w:val="Compact"/>
+            </w:pPr>
+            <w:r>
+              <w:t xml:space="preserve">lab Cu, 1.5406 Å</w:t>
+            </w:r>
+          </w:p>
+        </w:tc>
+        <w:tc>
+          <w:tcPr/>
+          <w:p>
+            <w:pPr>
+              <w:pStyle w:val="Compact"/>
+            </w:pPr>
+            <w:r>
+              <w:t xml:space="preserve">0.67</w:t>
+            </w:r>
+          </w:p>
+        </w:tc>
+        <w:tc>
+          <w:tcPr/>
+          <w:p>
+            <w:pPr>
+              <w:pStyle w:val="Compact"/>
+            </w:pPr>
+            <w:r>
+              <w:t xml:space="preserve">1</w:t>
+            </w:r>
+          </w:p>
+        </w:tc>
+        <w:tc>
+          <w:tcPr/>
+          <w:p>
+            <w:pPr>
+              <w:pStyle w:val="Compact"/>
+            </w:pPr>
+            <w:r>
+              <w:t xml:space="preserve">1</w:t>
+            </w:r>
+          </w:p>
+        </w:tc>
+        <w:tc>
+          <w:tcPr/>
+          <w:p>
+            <w:pPr>
+              <w:pStyle w:val="Compact"/>
+            </w:pPr>
+            <w:r>
+              <w:t xml:space="preserve">166,760</w:t>
+            </w:r>
+          </w:p>
+        </w:tc>
+        <w:tc>
+          <w:tcPr/>
+          <w:p>
+            <w:pPr>
+              <w:pStyle w:val="Compact"/>
+            </w:pPr>
+            <w:r>
+              <w:t xml:space="preserve">–</w:t>
+            </w:r>
+          </w:p>
+        </w:tc>
+        <w:tc>
+          <w:tcPr/>
+          <w:p>
+            <w:pPr>
+              <w:pStyle w:val="Compact"/>
+            </w:pPr>
+            <w:r>
+              <w:t xml:space="preserve">–</w:t>
+            </w:r>
+          </w:p>
+        </w:tc>
+      </w:tr>
+    </w:tbl>
     <w:bookmarkEnd w:id="24"/>
+    <w:bookmarkEnd w:id="25"/>
     <w:sectPr>
       <w:footnotePr>
         <w:numRestart w:val="eachSect"/>

</xml_diff>